<commit_message>
Rebuild T1 Python-I paper against PYTHON-1_T1_QUESTION_PAPER_GENERATION_GUIDELINES
Changes required by the guidelines PDF:
- unit blueprint: offline now exactly 2/6/8 and T1 total 2/10/13
- output MCQs now use e) Error and f) None of the above, option order fixed
- sets A/B/C differ only in MCQ sequence; options identical (S4)
- online paper is ONE integrated 9-mark Q-3(A), Bloom C, outside PB, with the
  Unit-1 connection through a required algorithm and flowchart (S9)
- marks column uses the department style: (10) and (09)
- template row heights and column widths preserved; floating->inline switch
  documented and reversible
- MCQ pool: dropped PB45, added PB160 so Unit 3 carries 5 MCQs
- Q-2(1) replaced by an operator-precedence / type-conversion question per S7
- faculty-only audit sheet with PB serial numbers, PB vs outside-PB class
- 268-check verifier covering S3-S11

Co-authored-by: arena-agent <297053741+arena-agent@users.noreply.github.com>
</commit_message>
<xml_diff>
--- a/QP_MDP_T1_PYTHON-I_SEM-I_2026/SET A_T1_PYTHON-1_TEST PAPER_SEM I_MDP.docx
+++ b/QP_MDP_T1_PYTHON-I_SEM-I_2026/SET A_T1_PYTHON-1_TEST PAPER_SEM I_MDP.docx
@@ -1222,7 +1222,7 @@
       </w:tr>
       <w:tr>
         <w:trPr>
-          <w:trHeight w:val="240"/>
+          <w:trHeight w:val="677"/>
         </w:trPr>
         <w:tc>
           <w:tcPr>
@@ -1320,7 +1320,7 @@
                 <w:sz w:val="20"/>
                 <w:szCs w:val="20"/>
               </w:rPr>
-              <w:t xml:space="preserve">10</w:t>
+              <w:t xml:space="preserve">(10)</w:t>
             </w:r>
           </w:p>
         </w:tc>
@@ -1355,7 +1355,7 @@
       </w:tr>
       <w:tr>
         <w:trPr>
-          <w:trHeight w:val="240"/>
+          <w:trHeight w:val="677"/>
         </w:trPr>
         <w:tc>
           <w:tcPr>
@@ -1425,7 +1425,189 @@
                 <w:sz w:val="22"/>
                 <w:szCs w:val="22"/>
               </w:rPr>
-              <w:t xml:space="preserve">A program that reads each of the instructions in mnemonic form and translates it into the machine-language equivalent is ______</w:t>
+              <w:t xml:space="preserve">Given the nested if-else structure below, what will be the value of x after code execution completes?</w:t>
+            </w:r>
+          </w:p>
+          <w:p>
+            <w:pPr>
+              <w:spacing w:after="0" w:line="216" w:lineRule="exact"/>
+              <w:ind w:left="180"/>
+            </w:pPr>
+            <w:r>
+              <w:rPr>
+                <w:rFonts w:ascii="Courier New" w:hAnsi="Courier New" w:cs="Courier New"/>
+                <w:sz w:val="18"/>
+                <w:szCs w:val="18"/>
+              </w:rPr>
+              <w:t xml:space="preserve">x = 0</w:t>
+            </w:r>
+          </w:p>
+          <w:p>
+            <w:pPr>
+              <w:spacing w:after="0" w:line="216" w:lineRule="exact"/>
+              <w:ind w:left="180"/>
+            </w:pPr>
+            <w:r>
+              <w:rPr>
+                <w:rFonts w:ascii="Courier New" w:hAnsi="Courier New" w:cs="Courier New"/>
+                <w:sz w:val="18"/>
+                <w:szCs w:val="18"/>
+              </w:rPr>
+              <w:t xml:space="preserve">a = 0</w:t>
+            </w:r>
+          </w:p>
+          <w:p>
+            <w:pPr>
+              <w:spacing w:after="0" w:line="216" w:lineRule="exact"/>
+              <w:ind w:left="180"/>
+            </w:pPr>
+            <w:r>
+              <w:rPr>
+                <w:rFonts w:ascii="Courier New" w:hAnsi="Courier New" w:cs="Courier New"/>
+                <w:sz w:val="18"/>
+                <w:szCs w:val="18"/>
+              </w:rPr>
+              <w:t xml:space="preserve">b = -5</w:t>
+            </w:r>
+          </w:p>
+          <w:p>
+            <w:pPr>
+              <w:spacing w:after="0" w:line="216" w:lineRule="exact"/>
+              <w:ind w:left="180"/>
+            </w:pPr>
+            <w:r>
+              <w:rPr>
+                <w:rFonts w:ascii="Courier New" w:hAnsi="Courier New" w:cs="Courier New"/>
+                <w:sz w:val="18"/>
+                <w:szCs w:val="18"/>
+              </w:rPr>
+              <w:t xml:space="preserve">if a &gt; 0:</w:t>
+            </w:r>
+          </w:p>
+          <w:p>
+            <w:pPr>
+              <w:spacing w:after="0" w:line="216" w:lineRule="exact"/>
+              <w:ind w:left="360"/>
+            </w:pPr>
+            <w:r>
+              <w:rPr>
+                <w:rFonts w:ascii="Courier New" w:hAnsi="Courier New" w:cs="Courier New"/>
+                <w:sz w:val="18"/>
+                <w:szCs w:val="18"/>
+              </w:rPr>
+              <w:t xml:space="preserve">if b &lt; 0:</w:t>
+            </w:r>
+          </w:p>
+          <w:p>
+            <w:pPr>
+              <w:spacing w:after="0" w:line="216" w:lineRule="exact"/>
+              <w:ind w:left="540"/>
+            </w:pPr>
+            <w:r>
+              <w:rPr>
+                <w:rFonts w:ascii="Courier New" w:hAnsi="Courier New" w:cs="Courier New"/>
+                <w:sz w:val="18"/>
+                <w:szCs w:val="18"/>
+              </w:rPr>
+              <w:t xml:space="preserve">x = x + 5</w:t>
+            </w:r>
+          </w:p>
+          <w:p>
+            <w:pPr>
+              <w:spacing w:after="0" w:line="216" w:lineRule="exact"/>
+              <w:ind w:left="360"/>
+            </w:pPr>
+            <w:r>
+              <w:rPr>
+                <w:rFonts w:ascii="Courier New" w:hAnsi="Courier New" w:cs="Courier New"/>
+                <w:sz w:val="18"/>
+                <w:szCs w:val="18"/>
+              </w:rPr>
+              <w:t xml:space="preserve">elif a &gt; 5:</w:t>
+            </w:r>
+          </w:p>
+          <w:p>
+            <w:pPr>
+              <w:spacing w:after="0" w:line="216" w:lineRule="exact"/>
+              <w:ind w:left="540"/>
+            </w:pPr>
+            <w:r>
+              <w:rPr>
+                <w:rFonts w:ascii="Courier New" w:hAnsi="Courier New" w:cs="Courier New"/>
+                <w:sz w:val="18"/>
+                <w:szCs w:val="18"/>
+              </w:rPr>
+              <w:t xml:space="preserve">x = x + 4</w:t>
+            </w:r>
+          </w:p>
+          <w:p>
+            <w:pPr>
+              <w:spacing w:after="0" w:line="216" w:lineRule="exact"/>
+              <w:ind w:left="360"/>
+            </w:pPr>
+            <w:r>
+              <w:rPr>
+                <w:rFonts w:ascii="Courier New" w:hAnsi="Courier New" w:cs="Courier New"/>
+                <w:sz w:val="18"/>
+                <w:szCs w:val="18"/>
+              </w:rPr>
+              <w:t xml:space="preserve">else:</w:t>
+            </w:r>
+          </w:p>
+          <w:p>
+            <w:pPr>
+              <w:spacing w:after="0" w:line="216" w:lineRule="exact"/>
+              <w:ind w:left="540"/>
+            </w:pPr>
+            <w:r>
+              <w:rPr>
+                <w:rFonts w:ascii="Courier New" w:hAnsi="Courier New" w:cs="Courier New"/>
+                <w:sz w:val="18"/>
+                <w:szCs w:val="18"/>
+              </w:rPr>
+              <w:t xml:space="preserve">x = x + 3</w:t>
+            </w:r>
+          </w:p>
+          <w:p>
+            <w:pPr>
+              <w:spacing w:after="0" w:line="216" w:lineRule="exact"/>
+              <w:ind w:left="180"/>
+            </w:pPr>
+            <w:r>
+              <w:rPr>
+                <w:rFonts w:ascii="Courier New" w:hAnsi="Courier New" w:cs="Courier New"/>
+                <w:sz w:val="18"/>
+                <w:szCs w:val="18"/>
+              </w:rPr>
+              <w:t xml:space="preserve">else:</w:t>
+            </w:r>
+          </w:p>
+          <w:p>
+            <w:pPr>
+              <w:spacing w:after="0" w:line="216" w:lineRule="exact"/>
+              <w:ind w:left="360"/>
+            </w:pPr>
+            <w:r>
+              <w:rPr>
+                <w:rFonts w:ascii="Courier New" w:hAnsi="Courier New" w:cs="Courier New"/>
+                <w:sz w:val="18"/>
+                <w:szCs w:val="18"/>
+              </w:rPr>
+              <w:t xml:space="preserve">x = x + 4</w:t>
+            </w:r>
+          </w:p>
+          <w:p>
+            <w:pPr>
+              <w:spacing w:after="0" w:line="216" w:lineRule="exact"/>
+              <w:ind w:left="180"/>
+            </w:pPr>
+            <w:r>
+              <w:rPr>
+                <w:rFonts w:ascii="Courier New" w:hAnsi="Courier New" w:cs="Courier New"/>
+                <w:sz w:val="18"/>
+                <w:szCs w:val="18"/>
+              </w:rPr>
+              <w:t xml:space="preserve">print(x)</w:t>
             </w:r>
           </w:p>
           <w:p>
@@ -1442,7 +1624,7 @@
                 <w:sz w:val="20"/>
                 <w:szCs w:val="20"/>
               </w:rPr>
-              <w:t xml:space="preserve">(A) Compiler</w:t>
+              <w:t xml:space="preserve">(a) 4</w:t>
             </w:r>
             <w:r>
               <w:rPr>
@@ -1458,7 +1640,7 @@
                 <w:sz w:val="20"/>
                 <w:szCs w:val="20"/>
               </w:rPr>
-              <w:t xml:space="preserve">(B) Assembler</w:t>
+              <w:t xml:space="preserve">(b) 0</w:t>
             </w:r>
             <w:r>
               <w:rPr>
@@ -1474,7 +1656,7 @@
                 <w:sz w:val="20"/>
                 <w:szCs w:val="20"/>
               </w:rPr>
-              <w:t xml:space="preserve">(C) Machine language</w:t>
+              <w:t xml:space="preserve">(c) 3</w:t>
             </w:r>
           </w:p>
           <w:p>
@@ -1491,7 +1673,7 @@
                 <w:sz w:val="20"/>
                 <w:szCs w:val="20"/>
               </w:rPr>
-              <w:t xml:space="preserve">(D) Interpreter</w:t>
+              <w:t xml:space="preserve">(d) 2</w:t>
             </w:r>
             <w:r>
               <w:rPr>
@@ -1507,7 +1689,7 @@
                 <w:sz w:val="20"/>
                 <w:szCs w:val="20"/>
               </w:rPr>
-              <w:t xml:space="preserve">(E) Loader</w:t>
+              <w:t xml:space="preserve">(e) Error</w:t>
             </w:r>
             <w:r>
               <w:rPr>
@@ -1523,7 +1705,7 @@
                 <w:sz w:val="20"/>
                 <w:szCs w:val="20"/>
               </w:rPr>
-              <w:t xml:space="preserve">(F) Linker</w:t>
+              <w:t xml:space="preserve">(f) None of the above</w:t>
             </w:r>
           </w:p>
         </w:tc>
@@ -1579,14 +1761,14 @@
                 <w:sz w:val="20"/>
                 <w:szCs w:val="20"/>
               </w:rPr>
-              <w:t xml:space="preserve">U</w:t>
+              <w:t xml:space="preserve">N</w:t>
             </w:r>
           </w:p>
         </w:tc>
       </w:tr>
       <w:tr>
         <w:trPr>
-          <w:trHeight w:val="240"/>
+          <w:trHeight w:val="677"/>
         </w:trPr>
         <w:tc>
           <w:tcPr>
@@ -1656,7 +1838,7 @@
                 <w:sz w:val="22"/>
                 <w:szCs w:val="22"/>
               </w:rPr>
-              <w:t xml:space="preserve">What will be the output of the following algorithm if the input is 4?</w:t>
+              <w:t xml:space="preserve">What will be the output of the following program on execution?</w:t>
             </w:r>
           </w:p>
           <w:p>
@@ -1670,7 +1852,7 @@
                 <w:sz w:val="18"/>
                 <w:szCs w:val="18"/>
               </w:rPr>
-              <w:t xml:space="preserve">Algorithm:</w:t>
+              <w:t xml:space="preserve">x=0</w:t>
             </w:r>
           </w:p>
           <w:p>
@@ -1684,13 +1866,13 @@
                 <w:sz w:val="18"/>
                 <w:szCs w:val="18"/>
               </w:rPr>
-              <w:t xml:space="preserve">1. Start</w:t>
+              <w:t xml:space="preserve">while x&lt;10:</w:t>
             </w:r>
           </w:p>
           <w:p>
             <w:pPr>
               <w:spacing w:after="0" w:line="216" w:lineRule="exact"/>
-              <w:ind w:left="180"/>
+              <w:ind w:left="360"/>
             </w:pPr>
             <w:r>
               <w:rPr>
@@ -1698,13 +1880,13 @@
                 <w:sz w:val="18"/>
                 <w:szCs w:val="18"/>
               </w:rPr>
-              <w:t xml:space="preserve">2. Set x = input value</w:t>
+              <w:t xml:space="preserve">if x%3==0:</w:t>
             </w:r>
           </w:p>
           <w:p>
             <w:pPr>
               <w:spacing w:after="0" w:line="216" w:lineRule="exact"/>
-              <w:ind w:left="180"/>
+              <w:ind w:left="540"/>
             </w:pPr>
             <w:r>
               <w:rPr>
@@ -1712,13 +1894,13 @@
                 <w:sz w:val="18"/>
                 <w:szCs w:val="18"/>
               </w:rPr>
-              <w:t xml:space="preserve">3. Set y = x * 2</w:t>
+              <w:t xml:space="preserve">x+=5</w:t>
             </w:r>
           </w:p>
           <w:p>
             <w:pPr>
               <w:spacing w:after="0" w:line="216" w:lineRule="exact"/>
-              <w:ind w:left="180"/>
+              <w:ind w:left="540"/>
             </w:pPr>
             <w:r>
               <w:rPr>
@@ -1726,13 +1908,13 @@
                 <w:sz w:val="18"/>
                 <w:szCs w:val="18"/>
               </w:rPr>
-              <w:t xml:space="preserve">4. If y &gt; 5, then print "Large", otherwise print "Small".</w:t>
+              <w:t xml:space="preserve">continue</w:t>
             </w:r>
           </w:p>
           <w:p>
             <w:pPr>
               <w:spacing w:after="0" w:line="216" w:lineRule="exact"/>
-              <w:ind w:left="180"/>
+              <w:ind w:left="360"/>
             </w:pPr>
             <w:r>
               <w:rPr>
@@ -1740,7 +1922,91 @@
                 <w:sz w:val="18"/>
                 <w:szCs w:val="18"/>
               </w:rPr>
-              <w:t xml:space="preserve">5. Stop</w:t>
+              <w:t xml:space="preserve">if x%2==0:</w:t>
+            </w:r>
+          </w:p>
+          <w:p>
+            <w:pPr>
+              <w:spacing w:after="0" w:line="216" w:lineRule="exact"/>
+              <w:ind w:left="540"/>
+            </w:pPr>
+            <w:r>
+              <w:rPr>
+                <w:rFonts w:ascii="Courier New" w:hAnsi="Courier New" w:cs="Courier New"/>
+                <w:sz w:val="18"/>
+                <w:szCs w:val="18"/>
+              </w:rPr>
+              <w:t xml:space="preserve">x+=14</w:t>
+            </w:r>
+          </w:p>
+          <w:p>
+            <w:pPr>
+              <w:spacing w:after="0" w:line="216" w:lineRule="exact"/>
+              <w:ind w:left="360"/>
+            </w:pPr>
+            <w:r>
+              <w:rPr>
+                <w:rFonts w:ascii="Courier New" w:hAnsi="Courier New" w:cs="Courier New"/>
+                <w:sz w:val="18"/>
+                <w:szCs w:val="18"/>
+              </w:rPr>
+              <w:t xml:space="preserve">else:</w:t>
+            </w:r>
+          </w:p>
+          <w:p>
+            <w:pPr>
+              <w:spacing w:after="0" w:line="216" w:lineRule="exact"/>
+              <w:ind w:left="540"/>
+            </w:pPr>
+            <w:r>
+              <w:rPr>
+                <w:rFonts w:ascii="Courier New" w:hAnsi="Courier New" w:cs="Courier New"/>
+                <w:sz w:val="18"/>
+                <w:szCs w:val="18"/>
+              </w:rPr>
+              <w:t xml:space="preserve">x+=1</w:t>
+            </w:r>
+          </w:p>
+          <w:p>
+            <w:pPr>
+              <w:spacing w:after="0" w:line="216" w:lineRule="exact"/>
+              <w:ind w:left="180"/>
+            </w:pPr>
+            <w:r>
+              <w:rPr>
+                <w:rFonts w:ascii="Courier New" w:hAnsi="Courier New" w:cs="Courier New"/>
+                <w:sz w:val="18"/>
+                <w:szCs w:val="18"/>
+              </w:rPr>
+              <w:t xml:space="preserve">else:</w:t>
+            </w:r>
+          </w:p>
+          <w:p>
+            <w:pPr>
+              <w:spacing w:after="0" w:line="216" w:lineRule="exact"/>
+              <w:ind w:left="360"/>
+            </w:pPr>
+            <w:r>
+              <w:rPr>
+                <w:rFonts w:ascii="Courier New" w:hAnsi="Courier New" w:cs="Courier New"/>
+                <w:sz w:val="18"/>
+                <w:szCs w:val="18"/>
+              </w:rPr>
+              <w:t xml:space="preserve">x+=1</w:t>
+            </w:r>
+          </w:p>
+          <w:p>
+            <w:pPr>
+              <w:spacing w:after="0" w:line="216" w:lineRule="exact"/>
+              <w:ind w:left="180"/>
+            </w:pPr>
+            <w:r>
+              <w:rPr>
+                <w:rFonts w:ascii="Courier New" w:hAnsi="Courier New" w:cs="Courier New"/>
+                <w:sz w:val="18"/>
+                <w:szCs w:val="18"/>
+              </w:rPr>
+              <w:t xml:space="preserve">print(x)</w:t>
             </w:r>
           </w:p>
           <w:p>
@@ -1757,7 +2023,7 @@
                 <w:sz w:val="20"/>
                 <w:szCs w:val="20"/>
               </w:rPr>
-              <w:t xml:space="preserve">(A) 4</w:t>
+              <w:t xml:space="preserve">(a) 10</w:t>
             </w:r>
             <w:r>
               <w:rPr>
@@ -1773,7 +2039,7 @@
                 <w:sz w:val="20"/>
                 <w:szCs w:val="20"/>
               </w:rPr>
-              <w:t xml:space="preserve">(B) Small</w:t>
+              <w:t xml:space="preserve">(b) 12</w:t>
             </w:r>
             <w:r>
               <w:rPr>
@@ -1789,7 +2055,7 @@
                 <w:sz w:val="20"/>
                 <w:szCs w:val="20"/>
               </w:rPr>
-              <w:t xml:space="preserve">(C) Error</w:t>
+              <w:t xml:space="preserve">(c) 11</w:t>
             </w:r>
           </w:p>
           <w:p>
@@ -1806,7 +2072,7 @@
                 <w:sz w:val="20"/>
                 <w:szCs w:val="20"/>
               </w:rPr>
-              <w:t xml:space="preserve">(D) 8</w:t>
+              <w:t xml:space="preserve">(d) 0</w:t>
             </w:r>
             <w:r>
               <w:rPr>
@@ -1822,7 +2088,7 @@
                 <w:sz w:val="20"/>
                 <w:szCs w:val="20"/>
               </w:rPr>
-              <w:t xml:space="preserve">(E) Large</w:t>
+              <w:t xml:space="preserve">(e) Error</w:t>
             </w:r>
             <w:r>
               <w:rPr>
@@ -1838,7 +2104,7 @@
                 <w:sz w:val="20"/>
                 <w:szCs w:val="20"/>
               </w:rPr>
-              <w:t xml:space="preserve">(F) No output</w:t>
+              <w:t xml:space="preserve">(f) None of the above</w:t>
             </w:r>
           </w:p>
         </w:tc>
@@ -1901,7 +2167,7 @@
       </w:tr>
       <w:tr>
         <w:trPr>
-          <w:trHeight w:val="240"/>
+          <w:trHeight w:val="677"/>
         </w:trPr>
         <w:tc>
           <w:tcPr>
@@ -2030,7 +2296,7 @@
                 <w:sz w:val="20"/>
                 <w:szCs w:val="20"/>
               </w:rPr>
-              <w:t xml:space="preserve">(A) 512, 64, 512</w:t>
+              <w:t xml:space="preserve">(a) 64, 512, 64</w:t>
             </w:r>
             <w:r>
               <w:rPr>
@@ -2046,7 +2312,7 @@
                 <w:sz w:val="20"/>
                 <w:szCs w:val="20"/>
               </w:rPr>
-              <w:t xml:space="preserve">(B) 512, 512, 512</w:t>
+              <w:t xml:space="preserve">(b) 64, 64, 64</w:t>
             </w:r>
             <w:r>
               <w:rPr>
@@ -2062,7 +2328,7 @@
                 <w:sz w:val="20"/>
                 <w:szCs w:val="20"/>
               </w:rPr>
-              <w:t xml:space="preserve">(C) 64, 512, 512</w:t>
+              <w:t xml:space="preserve">(c) 512, 64, 512</w:t>
             </w:r>
           </w:p>
           <w:p>
@@ -2079,7 +2345,7 @@
                 <w:sz w:val="20"/>
                 <w:szCs w:val="20"/>
               </w:rPr>
-              <w:t xml:space="preserve">(D) 64, 64, 64</w:t>
+              <w:t xml:space="preserve">(d) 512, 512, 512</w:t>
             </w:r>
             <w:r>
               <w:rPr>
@@ -2095,7 +2361,7 @@
                 <w:sz w:val="20"/>
                 <w:szCs w:val="20"/>
               </w:rPr>
-              <w:t xml:space="preserve">(E) 512, 512, 64</w:t>
+              <w:t xml:space="preserve">(e) Error</w:t>
             </w:r>
             <w:r>
               <w:rPr>
@@ -2111,7 +2377,7 @@
                 <w:sz w:val="20"/>
                 <w:szCs w:val="20"/>
               </w:rPr>
-              <w:t xml:space="preserve">(F) 64, 512, 64</w:t>
+              <w:t xml:space="preserve">(f) None of the above</w:t>
             </w:r>
           </w:p>
         </w:tc>
@@ -2174,7 +2440,7 @@
       </w:tr>
       <w:tr>
         <w:trPr>
-          <w:trHeight w:val="240"/>
+          <w:trHeight w:val="677"/>
         </w:trPr>
         <w:tc>
           <w:tcPr>
@@ -2244,7 +2510,7 @@
                 <w:sz w:val="22"/>
                 <w:szCs w:val="22"/>
               </w:rPr>
-              <w:t xml:space="preserve">What will be the output of the following program on execution?</w:t>
+              <w:t xml:space="preserve">What should be the output of the following python code snippet?</w:t>
             </w:r>
           </w:p>
           <w:p>
@@ -2258,7 +2524,7 @@
                 <w:sz w:val="18"/>
                 <w:szCs w:val="18"/>
               </w:rPr>
-              <w:t xml:space="preserve">a=0</w:t>
+              <w:t xml:space="preserve">a=5</w:t>
             </w:r>
           </w:p>
           <w:p>
@@ -2272,7 +2538,7 @@
                 <w:sz w:val="18"/>
                 <w:szCs w:val="18"/>
               </w:rPr>
-              <w:t xml:space="preserve">b=6</w:t>
+              <w:t xml:space="preserve">b=7</w:t>
             </w:r>
           </w:p>
           <w:p>
@@ -2286,7 +2552,7 @@
                 <w:sz w:val="18"/>
                 <w:szCs w:val="18"/>
               </w:rPr>
-              <w:t xml:space="preserve">x=(a or b) or ((a and a) or (a and b))</w:t>
+              <w:t xml:space="preserve">c=2</w:t>
             </w:r>
           </w:p>
           <w:p>
@@ -2300,7 +2566,91 @@
                 <w:sz w:val="18"/>
                 <w:szCs w:val="18"/>
               </w:rPr>
-              <w:t xml:space="preserve">print(x)</w:t>
+              <w:t xml:space="preserve">if a&gt;b:</w:t>
+            </w:r>
+          </w:p>
+          <w:p>
+            <w:pPr>
+              <w:spacing w:after="0" w:line="216" w:lineRule="exact"/>
+              <w:ind w:left="360"/>
+            </w:pPr>
+            <w:r>
+              <w:rPr>
+                <w:rFonts w:ascii="Courier New" w:hAnsi="Courier New" w:cs="Courier New"/>
+                <w:sz w:val="18"/>
+                <w:szCs w:val="18"/>
+              </w:rPr>
+              <w:t xml:space="preserve">a,b = b,a</w:t>
+            </w:r>
+          </w:p>
+          <w:p>
+            <w:pPr>
+              <w:spacing w:after="0" w:line="216" w:lineRule="exact"/>
+              <w:ind w:left="180"/>
+            </w:pPr>
+            <w:r>
+              <w:rPr>
+                <w:rFonts w:ascii="Courier New" w:hAnsi="Courier New" w:cs="Courier New"/>
+                <w:sz w:val="18"/>
+                <w:szCs w:val="18"/>
+              </w:rPr>
+              <w:t xml:space="preserve">if a&gt;c:</w:t>
+            </w:r>
+          </w:p>
+          <w:p>
+            <w:pPr>
+              <w:spacing w:after="0" w:line="216" w:lineRule="exact"/>
+              <w:ind w:left="360"/>
+            </w:pPr>
+            <w:r>
+              <w:rPr>
+                <w:rFonts w:ascii="Courier New" w:hAnsi="Courier New" w:cs="Courier New"/>
+                <w:sz w:val="18"/>
+                <w:szCs w:val="18"/>
+              </w:rPr>
+              <w:t xml:space="preserve">a,c = c,a</w:t>
+            </w:r>
+          </w:p>
+          <w:p>
+            <w:pPr>
+              <w:spacing w:after="0" w:line="216" w:lineRule="exact"/>
+              <w:ind w:left="180"/>
+            </w:pPr>
+            <w:r>
+              <w:rPr>
+                <w:rFonts w:ascii="Courier New" w:hAnsi="Courier New" w:cs="Courier New"/>
+                <w:sz w:val="18"/>
+                <w:szCs w:val="18"/>
+              </w:rPr>
+              <w:t xml:space="preserve">if b&gt;c:</w:t>
+            </w:r>
+          </w:p>
+          <w:p>
+            <w:pPr>
+              <w:spacing w:after="0" w:line="216" w:lineRule="exact"/>
+              <w:ind w:left="360"/>
+            </w:pPr>
+            <w:r>
+              <w:rPr>
+                <w:rFonts w:ascii="Courier New" w:hAnsi="Courier New" w:cs="Courier New"/>
+                <w:sz w:val="18"/>
+                <w:szCs w:val="18"/>
+              </w:rPr>
+              <w:t xml:space="preserve">b,c = c,b</w:t>
+            </w:r>
+          </w:p>
+          <w:p>
+            <w:pPr>
+              <w:spacing w:after="0" w:line="216" w:lineRule="exact"/>
+              <w:ind w:left="180"/>
+            </w:pPr>
+            <w:r>
+              <w:rPr>
+                <w:rFonts w:ascii="Courier New" w:hAnsi="Courier New" w:cs="Courier New"/>
+                <w:sz w:val="18"/>
+                <w:szCs w:val="18"/>
+              </w:rPr>
+              <w:t xml:space="preserve">print(a,b,c,end=",")</w:t>
             </w:r>
           </w:p>
           <w:p>
@@ -2317,7 +2667,7 @@
                 <w:sz w:val="20"/>
                 <w:szCs w:val="20"/>
               </w:rPr>
-              <w:t xml:space="preserve">(A) None</w:t>
+              <w:t xml:space="preserve">(a) 7 5 2</w:t>
             </w:r>
             <w:r>
               <w:rPr>
@@ -2333,7 +2683,7 @@
                 <w:sz w:val="20"/>
                 <w:szCs w:val="20"/>
               </w:rPr>
-              <w:t xml:space="preserve">(B) True</w:t>
+              <w:t xml:space="preserve">(b) 2 7 5</w:t>
             </w:r>
             <w:r>
               <w:rPr>
@@ -2349,7 +2699,7 @@
                 <w:sz w:val="20"/>
                 <w:szCs w:val="20"/>
               </w:rPr>
-              <w:t xml:space="preserve">(C) False</w:t>
+              <w:t xml:space="preserve">(c) 5 2 7</w:t>
             </w:r>
           </w:p>
           <w:p>
@@ -2366,7 +2716,7 @@
                 <w:sz w:val="20"/>
                 <w:szCs w:val="20"/>
               </w:rPr>
-              <w:t xml:space="preserve">(D) 6</w:t>
+              <w:t xml:space="preserve">(d) 2 5 7</w:t>
             </w:r>
             <w:r>
               <w:rPr>
@@ -2382,7 +2732,7 @@
                 <w:sz w:val="20"/>
                 <w:szCs w:val="20"/>
               </w:rPr>
-              <w:t xml:space="preserve">(E) Error</w:t>
+              <w:t xml:space="preserve">(e) Error</w:t>
             </w:r>
             <w:r>
               <w:rPr>
@@ -2398,7 +2748,7 @@
                 <w:sz w:val="20"/>
                 <w:szCs w:val="20"/>
               </w:rPr>
-              <w:t xml:space="preserve">(F) 0</w:t>
+              <w:t xml:space="preserve">(f) None of the above</w:t>
             </w:r>
           </w:p>
         </w:tc>
@@ -2461,7 +2811,7 @@
       </w:tr>
       <w:tr>
         <w:trPr>
-          <w:trHeight w:val="240"/>
+          <w:trHeight w:val="677"/>
         </w:trPr>
         <w:tc>
           <w:tcPr>
@@ -2514,235 +2864,6 @@
                 <w:szCs w:val="22"/>
               </w:rPr>
               <w:t xml:space="preserve">5)</w:t>
-            </w:r>
-          </w:p>
-        </w:tc>
-        <w:tc>
-          <w:tcPr>
-            <w:tcW w:w="8396" w:type="dxa"/>
-          </w:tcPr>
-          <w:p>
-            <w:pPr>
-              <w:spacing w:after="0" w:line="240" w:lineRule="auto"/>
-            </w:pPr>
-            <w:r>
-              <w:rPr>
-                <w:rFonts w:ascii="Times New Roman" w:hAnsi="Times New Roman" w:cs="Times New Roman"/>
-                <w:sz w:val="22"/>
-                <w:szCs w:val="22"/>
-              </w:rPr>
-              <w:t xml:space="preserve">Which of the following is an invalid statement?</w:t>
-            </w:r>
-          </w:p>
-          <w:p>
-            <w:pPr>
-              <w:tabs>
-                <w:tab w:val="left" w:pos="4200"/>
-              </w:tabs>
-              <w:spacing w:after="0" w:line="240" w:lineRule="auto"/>
-            </w:pPr>
-            <w:r>
-              <w:rPr>
-                <w:rFonts w:ascii="Times New Roman" w:hAnsi="Times New Roman" w:cs="Times New Roman"/>
-                <w:sz w:val="20"/>
-                <w:szCs w:val="20"/>
-              </w:rPr>
-              <w:t xml:space="preserve">(A) a = b = c = 1000</w:t>
-            </w:r>
-            <w:r>
-              <w:rPr>
-                <w:rFonts w:ascii="Times New Roman" w:hAnsi="Times New Roman" w:cs="Times New Roman"/>
-                <w:sz w:val="20"/>
-                <w:szCs w:val="20"/>
-              </w:rPr>
-              <w:tab/>
-            </w:r>
-            <w:r>
-              <w:rPr>
-                <w:rFonts w:ascii="Times New Roman" w:hAnsi="Times New Roman" w:cs="Times New Roman"/>
-                <w:sz w:val="20"/>
-                <w:szCs w:val="20"/>
-              </w:rPr>
-              <w:t xml:space="preserve">(B) abc = 1,000,000</w:t>
-            </w:r>
-          </w:p>
-          <w:p>
-            <w:pPr>
-              <w:tabs>
-                <w:tab w:val="left" w:pos="4200"/>
-              </w:tabs>
-              <w:spacing w:after="0" w:line="240" w:lineRule="auto"/>
-            </w:pPr>
-            <w:r>
-              <w:rPr>
-                <w:rFonts w:ascii="Times New Roman" w:hAnsi="Times New Roman" w:cs="Times New Roman"/>
-                <w:sz w:val="20"/>
-                <w:szCs w:val="20"/>
-              </w:rPr>
-              <w:t xml:space="preserve">(C) a_b_c = 1,000,000</w:t>
-            </w:r>
-            <w:r>
-              <w:rPr>
-                <w:rFonts w:ascii="Times New Roman" w:hAnsi="Times New Roman" w:cs="Times New Roman"/>
-                <w:sz w:val="20"/>
-                <w:szCs w:val="20"/>
-              </w:rPr>
-              <w:tab/>
-            </w:r>
-            <w:r>
-              <w:rPr>
-                <w:rFonts w:ascii="Times New Roman" w:hAnsi="Times New Roman" w:cs="Times New Roman"/>
-                <w:sz w:val="20"/>
-                <w:szCs w:val="20"/>
-              </w:rPr>
-              <w:t xml:space="preserve">(D) a,b,c = 1000, 2000, 3000</w:t>
-            </w:r>
-          </w:p>
-          <w:p>
-            <w:pPr>
-              <w:tabs>
-                <w:tab w:val="left" w:pos="4200"/>
-              </w:tabs>
-              <w:spacing w:after="0" w:line="240" w:lineRule="auto"/>
-            </w:pPr>
-            <w:r>
-              <w:rPr>
-                <w:rFonts w:ascii="Times New Roman" w:hAnsi="Times New Roman" w:cs="Times New Roman"/>
-                <w:sz w:val="20"/>
-                <w:szCs w:val="20"/>
-              </w:rPr>
-              <w:t xml:space="preserve">(E) a, b, c = 1000, 2000, 3000</w:t>
-            </w:r>
-            <w:r>
-              <w:rPr>
-                <w:rFonts w:ascii="Times New Roman" w:hAnsi="Times New Roman" w:cs="Times New Roman"/>
-                <w:sz w:val="20"/>
-                <w:szCs w:val="20"/>
-              </w:rPr>
-              <w:tab/>
-            </w:r>
-            <w:r>
-              <w:rPr>
-                <w:rFonts w:ascii="Times New Roman" w:hAnsi="Times New Roman" w:cs="Times New Roman"/>
-                <w:sz w:val="20"/>
-                <w:szCs w:val="20"/>
-              </w:rPr>
-              <w:t xml:space="preserve">(F) a b c = 1000 2000 3000</w:t>
-            </w:r>
-          </w:p>
-        </w:tc>
-        <w:tc>
-          <w:tcPr>
-            <w:tcW w:w="810" w:type="dxa"/>
-          </w:tcPr>
-          <w:p>
-            <w:pPr>
-              <w:spacing w:after="0" w:line="240" w:lineRule="auto"/>
-              <w:jc w:val="center"/>
-              <w:rPr>
-                <w:rFonts w:ascii="Times New Roman" w:hAnsi="Times New Roman"/>
-                <w:b/>
-                <w:bCs/>
-                <w:sz w:val="24"/>
-                <w:szCs w:val="24"/>
-              </w:rPr>
-            </w:pPr>
-            <w:r>
-              <w:rPr>
-                <w:rFonts w:ascii="Times New Roman" w:hAnsi="Times New Roman" w:cs="Times New Roman"/>
-                <w:b/>
-                <w:bCs/>
-                <w:sz w:val="20"/>
-                <w:szCs w:val="20"/>
-              </w:rPr>
-              <w:t xml:space="preserve">1</w:t>
-            </w:r>
-          </w:p>
-        </w:tc>
-        <w:tc>
-          <w:tcPr>
-            <w:tcW w:w="841" w:type="dxa"/>
-          </w:tcPr>
-          <w:p>
-            <w:pPr>
-              <w:spacing w:after="0" w:line="240" w:lineRule="auto"/>
-              <w:jc w:val="center"/>
-              <w:rPr>
-                <w:rFonts w:ascii="Times New Roman" w:hAnsi="Times New Roman"/>
-                <w:b/>
-                <w:bCs/>
-                <w:sz w:val="24"/>
-                <w:szCs w:val="24"/>
-              </w:rPr>
-            </w:pPr>
-            <w:r>
-              <w:rPr>
-                <w:rFonts w:ascii="Times New Roman" w:hAnsi="Times New Roman" w:cs="Times New Roman"/>
-                <w:b/>
-                <w:bCs/>
-                <w:sz w:val="20"/>
-                <w:szCs w:val="20"/>
-              </w:rPr>
-              <w:t xml:space="preserve">U</w:t>
-            </w:r>
-          </w:p>
-        </w:tc>
-      </w:tr>
-      <w:tr>
-        <w:trPr>
-          <w:trHeight w:val="240"/>
-        </w:trPr>
-        <w:tc>
-          <w:tcPr>
-            <w:tcW w:w="642" w:type="dxa"/>
-          </w:tcPr>
-          <w:p>
-            <w:pPr>
-              <w:spacing w:after="0" w:line="240" w:lineRule="auto"/>
-              <w:rPr>
-                <w:rFonts w:ascii="Times New Roman" w:hAnsi="Times New Roman"/>
-                <w:b/>
-                <w:bCs/>
-                <w:sz w:val="24"/>
-                <w:szCs w:val="24"/>
-              </w:rPr>
-            </w:pPr>
-            <w:r>
-              <w:rPr>
-                <w:rFonts w:ascii="Times New Roman" w:hAnsi="Times New Roman" w:cs="Times New Roman"/>
-                <w:b/>
-                <w:bCs/>
-                <w:sz w:val="22"/>
-                <w:szCs w:val="22"/>
-              </w:rPr>
-              <w:t xml:space="preserve"/>
-            </w:r>
-          </w:p>
-        </w:tc>
-        <w:tc>
-          <w:tcPr>
-            <w:tcW w:w="497" w:type="dxa"/>
-          </w:tcPr>
-          <w:p>
-            <w:pPr>
-              <w:spacing w:after="0" w:line="240" w:lineRule="auto"/>
-              <w:rPr>
-                <w:rFonts w:ascii="Times New Roman" w:hAnsi="Times New Roman"/>
-                <w:b/>
-                <w:bCs/>
-                <w:sz w:val="24"/>
-                <w:szCs w:val="24"/>
-              </w:rPr>
-            </w:pPr>
-            <w:r>
-              <w:rPr>
-                <w:rFonts w:ascii="Times New Roman" w:hAnsi="Times New Roman" w:cs="Times New Roman"/>
-                <w:b/>
-                <w:bCs/>
-                <w:sz w:val="22"/>
-                <w:szCs w:val="22"/>
-              </w:rPr>
-              <w:t xml:space="preserve">6)</w:t>
             </w:r>
           </w:p>
         </w:tc>
@@ -2819,7 +2940,7 @@
                 <w:sz w:val="20"/>
                 <w:szCs w:val="20"/>
               </w:rPr>
-              <w:t xml:space="preserve">(A) 60</w:t>
+              <w:t xml:space="preserve">(a) 0</w:t>
             </w:r>
             <w:r>
               <w:rPr>
@@ -2835,7 +2956,7 @@
                 <w:sz w:val="20"/>
                 <w:szCs w:val="20"/>
               </w:rPr>
-              <w:t xml:space="preserve">(B) 50</w:t>
+              <w:t xml:space="preserve">(b) 60</w:t>
             </w:r>
             <w:r>
               <w:rPr>
@@ -2851,7 +2972,7 @@
                 <w:sz w:val="20"/>
                 <w:szCs w:val="20"/>
               </w:rPr>
-              <w:t xml:space="preserve">(C) Error</w:t>
+              <w:t xml:space="preserve">(c) 50</w:t>
             </w:r>
           </w:p>
           <w:p>
@@ -2868,7 +2989,7 @@
                 <w:sz w:val="20"/>
                 <w:szCs w:val="20"/>
               </w:rPr>
-              <w:t xml:space="preserve">(D) 60.0</w:t>
+              <w:t xml:space="preserve">(d) 60.0</w:t>
             </w:r>
             <w:r>
               <w:rPr>
@@ -2884,7 +3005,7 @@
                 <w:sz w:val="20"/>
                 <w:szCs w:val="20"/>
               </w:rPr>
-              <w:t xml:space="preserve">(E) 0</w:t>
+              <w:t xml:space="preserve">(e) Error</w:t>
             </w:r>
             <w:r>
               <w:rPr>
@@ -2900,7 +3021,7 @@
                 <w:sz w:val="20"/>
                 <w:szCs w:val="20"/>
               </w:rPr>
-              <w:t xml:space="preserve">(F) 1</w:t>
+              <w:t xml:space="preserve">(f) None of the above</w:t>
             </w:r>
           </w:p>
         </w:tc>
@@ -2963,7 +3084,7 @@
       </w:tr>
       <w:tr>
         <w:trPr>
-          <w:trHeight w:val="240"/>
+          <w:trHeight w:val="677"/>
         </w:trPr>
         <w:tc>
           <w:tcPr>
@@ -3015,7 +3136,7 @@
                 <w:sz w:val="22"/>
                 <w:szCs w:val="22"/>
               </w:rPr>
-              <w:t xml:space="preserve">7)</w:t>
+              <w:t xml:space="preserve">6)</w:t>
             </w:r>
           </w:p>
         </w:tc>
@@ -3033,7 +3154,7 @@
                 <w:sz w:val="22"/>
                 <w:szCs w:val="22"/>
               </w:rPr>
-              <w:t xml:space="preserve">Given the nested if-else structure below, what will be the value of x after code execution completes?</w:t>
+              <w:t xml:space="preserve">What is the output of the following code?</w:t>
             </w:r>
           </w:p>
           <w:p>
@@ -3047,7 +3168,7 @@
                 <w:sz w:val="18"/>
                 <w:szCs w:val="18"/>
               </w:rPr>
-              <w:t xml:space="preserve">x = 0</w:t>
+              <w:t xml:space="preserve">n=10</w:t>
             </w:r>
           </w:p>
           <w:p>
@@ -3061,7 +3182,7 @@
                 <w:sz w:val="18"/>
                 <w:szCs w:val="18"/>
               </w:rPr>
-              <w:t xml:space="preserve">a = 0</w:t>
+              <w:t xml:space="preserve">i=1</w:t>
             </w:r>
           </w:p>
           <w:p>
@@ -3075,13 +3196,13 @@
                 <w:sz w:val="18"/>
                 <w:szCs w:val="18"/>
               </w:rPr>
-              <w:t xml:space="preserve">b = -5</w:t>
+              <w:t xml:space="preserve">while(i&lt;=n):</w:t>
             </w:r>
           </w:p>
           <w:p>
             <w:pPr>
               <w:spacing w:after="0" w:line="216" w:lineRule="exact"/>
-              <w:ind w:left="180"/>
+              <w:ind w:left="360"/>
             </w:pPr>
             <w:r>
               <w:rPr>
@@ -3089,7 +3210,7 @@
                 <w:sz w:val="18"/>
                 <w:szCs w:val="18"/>
               </w:rPr>
-              <w:t xml:space="preserve">if a &gt; 0:</w:t>
+              <w:t xml:space="preserve">k=0</w:t>
             </w:r>
           </w:p>
           <w:p>
@@ -3103,7 +3224,7 @@
                 <w:sz w:val="18"/>
                 <w:szCs w:val="18"/>
               </w:rPr>
-              <w:t xml:space="preserve">if b &lt; 0:</w:t>
+              <w:t xml:space="preserve">if(n%i==0):</w:t>
             </w:r>
           </w:p>
           <w:p>
@@ -3117,13 +3238,13 @@
                 <w:sz w:val="18"/>
                 <w:szCs w:val="18"/>
               </w:rPr>
-              <w:t xml:space="preserve">x = x + 5</w:t>
+              <w:t xml:space="preserve">j=1</w:t>
             </w:r>
           </w:p>
           <w:p>
             <w:pPr>
               <w:spacing w:after="0" w:line="216" w:lineRule="exact"/>
-              <w:ind w:left="360"/>
+              <w:ind w:left="540"/>
             </w:pPr>
             <w:r>
               <w:rPr>
@@ -3131,13 +3252,13 @@
                 <w:sz w:val="18"/>
                 <w:szCs w:val="18"/>
               </w:rPr>
-              <w:t xml:space="preserve">elif a &gt; 5:</w:t>
+              <w:t xml:space="preserve">while(j&lt;=i):</w:t>
             </w:r>
           </w:p>
           <w:p>
             <w:pPr>
               <w:spacing w:after="0" w:line="216" w:lineRule="exact"/>
-              <w:ind w:left="540"/>
+              <w:ind w:left="720"/>
             </w:pPr>
             <w:r>
               <w:rPr>
@@ -3145,13 +3266,13 @@
                 <w:sz w:val="18"/>
                 <w:szCs w:val="18"/>
               </w:rPr>
-              <w:t xml:space="preserve">x = x + 4</w:t>
+              <w:t xml:space="preserve">if(i%j==0):</w:t>
             </w:r>
           </w:p>
           <w:p>
             <w:pPr>
               <w:spacing w:after="0" w:line="216" w:lineRule="exact"/>
-              <w:ind w:left="360"/>
+              <w:ind w:left="900"/>
             </w:pPr>
             <w:r>
               <w:rPr>
@@ -3159,13 +3280,13 @@
                 <w:sz w:val="18"/>
                 <w:szCs w:val="18"/>
               </w:rPr>
-              <w:t xml:space="preserve">else:</w:t>
+              <w:t xml:space="preserve">k=k+1</w:t>
             </w:r>
           </w:p>
           <w:p>
             <w:pPr>
               <w:spacing w:after="0" w:line="216" w:lineRule="exact"/>
-              <w:ind w:left="540"/>
+              <w:ind w:left="720"/>
             </w:pPr>
             <w:r>
               <w:rPr>
@@ -3173,13 +3294,13 @@
                 <w:sz w:val="18"/>
                 <w:szCs w:val="18"/>
               </w:rPr>
-              <w:t xml:space="preserve">x = x + 3</w:t>
+              <w:t xml:space="preserve">j=j+1</w:t>
             </w:r>
           </w:p>
           <w:p>
             <w:pPr>
               <w:spacing w:after="0" w:line="216" w:lineRule="exact"/>
-              <w:ind w:left="180"/>
+              <w:ind w:left="540"/>
             </w:pPr>
             <w:r>
               <w:rPr>
@@ -3187,13 +3308,13 @@
                 <w:sz w:val="18"/>
                 <w:szCs w:val="18"/>
               </w:rPr>
-              <w:t xml:space="preserve">else:</w:t>
+              <w:t xml:space="preserve">if(k==2):</w:t>
             </w:r>
           </w:p>
           <w:p>
             <w:pPr>
               <w:spacing w:after="0" w:line="216" w:lineRule="exact"/>
-              <w:ind w:left="360"/>
+              <w:ind w:left="720"/>
             </w:pPr>
             <w:r>
               <w:rPr>
@@ -3201,13 +3322,13 @@
                 <w:sz w:val="18"/>
                 <w:szCs w:val="18"/>
               </w:rPr>
-              <w:t xml:space="preserve">x = x + 4</w:t>
+              <w:t xml:space="preserve">print(i,end=" ")</w:t>
             </w:r>
           </w:p>
           <w:p>
             <w:pPr>
               <w:spacing w:after="0" w:line="216" w:lineRule="exact"/>
-              <w:ind w:left="180"/>
+              <w:ind w:left="360"/>
             </w:pPr>
             <w:r>
               <w:rPr>
@@ -3215,7 +3336,7 @@
                 <w:sz w:val="18"/>
                 <w:szCs w:val="18"/>
               </w:rPr>
-              <w:t xml:space="preserve">print(x)</w:t>
+              <w:t xml:space="preserve">i=i+1</w:t>
             </w:r>
           </w:p>
           <w:p>
@@ -3232,7 +3353,7 @@
                 <w:sz w:val="20"/>
                 <w:szCs w:val="20"/>
               </w:rPr>
-              <w:t xml:space="preserve">(A) 5</w:t>
+              <w:t xml:space="preserve">(a) 1 2 5 10</w:t>
             </w:r>
             <w:r>
               <w:rPr>
@@ -3248,7 +3369,7 @@
                 <w:sz w:val="20"/>
                 <w:szCs w:val="20"/>
               </w:rPr>
-              <w:t xml:space="preserve">(B) 2</w:t>
+              <w:t xml:space="preserve">(b) 2 5</w:t>
             </w:r>
             <w:r>
               <w:rPr>
@@ -3264,7 +3385,7 @@
                 <w:sz w:val="20"/>
                 <w:szCs w:val="20"/>
               </w:rPr>
-              <w:t xml:space="preserve">(C) 3</w:t>
+              <w:t xml:space="preserve">(c) 2 3 5 7</w:t>
             </w:r>
           </w:p>
           <w:p>
@@ -3281,7 +3402,7 @@
                 <w:sz w:val="20"/>
                 <w:szCs w:val="20"/>
               </w:rPr>
-              <w:t xml:space="preserve">(D) 4</w:t>
+              <w:t xml:space="preserve">(d) 2 5 10</w:t>
             </w:r>
             <w:r>
               <w:rPr>
@@ -3297,7 +3418,7 @@
                 <w:sz w:val="20"/>
                 <w:szCs w:val="20"/>
               </w:rPr>
-              <w:t xml:space="preserve">(E) 9</w:t>
+              <w:t xml:space="preserve">(e) Error</w:t>
             </w:r>
             <w:r>
               <w:rPr>
@@ -3313,7 +3434,7 @@
                 <w:sz w:val="20"/>
                 <w:szCs w:val="20"/>
               </w:rPr>
-              <w:t xml:space="preserve">(F) 0</w:t>
+              <w:t xml:space="preserve">(f) None of the above</w:t>
             </w:r>
           </w:p>
         </w:tc>
@@ -3376,7 +3497,7 @@
       </w:tr>
       <w:tr>
         <w:trPr>
-          <w:trHeight w:val="240"/>
+          <w:trHeight w:val="677"/>
         </w:trPr>
         <w:tc>
           <w:tcPr>
@@ -3428,7 +3549,7 @@
                 <w:sz w:val="22"/>
                 <w:szCs w:val="22"/>
               </w:rPr>
-              <w:t xml:space="preserve">8)</w:t>
+              <w:t xml:space="preserve">7)</w:t>
             </w:r>
           </w:p>
         </w:tc>
@@ -3474,13 +3595,13 @@
                 <w:sz w:val="18"/>
                 <w:szCs w:val="18"/>
               </w:rPr>
-              <w:t xml:space="preserve">while x&lt;10:</w:t>
+              <w:t xml:space="preserve">count=0</w:t>
             </w:r>
           </w:p>
           <w:p>
             <w:pPr>
               <w:spacing w:after="0" w:line="216" w:lineRule="exact"/>
-              <w:ind w:left="360"/>
+              <w:ind w:left="180"/>
             </w:pPr>
             <w:r>
               <w:rPr>
@@ -3488,13 +3609,13 @@
                 <w:sz w:val="18"/>
                 <w:szCs w:val="18"/>
               </w:rPr>
-              <w:t xml:space="preserve">if x%3==0:</w:t>
+              <w:t xml:space="preserve">while x&lt;15:</w:t>
             </w:r>
           </w:p>
           <w:p>
             <w:pPr>
               <w:spacing w:after="0" w:line="216" w:lineRule="exact"/>
-              <w:ind w:left="540"/>
+              <w:ind w:left="360"/>
             </w:pPr>
             <w:r>
               <w:rPr>
@@ -3502,7 +3623,7 @@
                 <w:sz w:val="18"/>
                 <w:szCs w:val="18"/>
               </w:rPr>
-              <w:t xml:space="preserve">x+=5</w:t>
+              <w:t xml:space="preserve">if x%2==0:</w:t>
             </w:r>
           </w:p>
           <w:p>
@@ -3516,13 +3637,13 @@
                 <w:sz w:val="18"/>
                 <w:szCs w:val="18"/>
               </w:rPr>
-              <w:t xml:space="preserve">continue</w:t>
+              <w:t xml:space="preserve">x+=1</w:t>
             </w:r>
           </w:p>
           <w:p>
             <w:pPr>
               <w:spacing w:after="0" w:line="216" w:lineRule="exact"/>
-              <w:ind w:left="360"/>
+              <w:ind w:left="540"/>
             </w:pPr>
             <w:r>
               <w:rPr>
@@ -3530,13 +3651,13 @@
                 <w:sz w:val="18"/>
                 <w:szCs w:val="18"/>
               </w:rPr>
-              <w:t xml:space="preserve">if x%2==0:</w:t>
+              <w:t xml:space="preserve">continue</w:t>
             </w:r>
           </w:p>
           <w:p>
             <w:pPr>
               <w:spacing w:after="0" w:line="216" w:lineRule="exact"/>
-              <w:ind w:left="540"/>
+              <w:ind w:left="360"/>
             </w:pPr>
             <w:r>
               <w:rPr>
@@ -3544,13 +3665,13 @@
                 <w:sz w:val="18"/>
                 <w:szCs w:val="18"/>
               </w:rPr>
-              <w:t xml:space="preserve">x+=14</w:t>
+              <w:t xml:space="preserve">if x%3==0:</w:t>
             </w:r>
           </w:p>
           <w:p>
             <w:pPr>
               <w:spacing w:after="0" w:line="216" w:lineRule="exact"/>
-              <w:ind w:left="360"/>
+              <w:ind w:left="540"/>
             </w:pPr>
             <w:r>
               <w:rPr>
@@ -3558,7 +3679,7 @@
                 <w:sz w:val="18"/>
                 <w:szCs w:val="18"/>
               </w:rPr>
-              <w:t xml:space="preserve">else:</w:t>
+              <w:t xml:space="preserve">x+=1</w:t>
             </w:r>
           </w:p>
           <w:p>
@@ -3572,13 +3693,13 @@
                 <w:sz w:val="18"/>
                 <w:szCs w:val="18"/>
               </w:rPr>
-              <w:t xml:space="preserve">x+=1</w:t>
+              <w:t xml:space="preserve">continue</w:t>
             </w:r>
           </w:p>
           <w:p>
             <w:pPr>
               <w:spacing w:after="0" w:line="216" w:lineRule="exact"/>
-              <w:ind w:left="180"/>
+              <w:ind w:left="360"/>
             </w:pPr>
             <w:r>
               <w:rPr>
@@ -3586,13 +3707,13 @@
                 <w:sz w:val="18"/>
                 <w:szCs w:val="18"/>
               </w:rPr>
-              <w:t xml:space="preserve">else:</w:t>
+              <w:t xml:space="preserve">if count==5:</w:t>
             </w:r>
           </w:p>
           <w:p>
             <w:pPr>
               <w:spacing w:after="0" w:line="216" w:lineRule="exact"/>
-              <w:ind w:left="360"/>
+              <w:ind w:left="540"/>
             </w:pPr>
             <w:r>
               <w:rPr>
@@ -3600,13 +3721,13 @@
                 <w:sz w:val="18"/>
                 <w:szCs w:val="18"/>
               </w:rPr>
-              <w:t xml:space="preserve">x+=1</w:t>
+              <w:t xml:space="preserve">break</w:t>
             </w:r>
           </w:p>
           <w:p>
             <w:pPr>
               <w:spacing w:after="0" w:line="216" w:lineRule="exact"/>
-              <w:ind w:left="180"/>
+              <w:ind w:left="360"/>
             </w:pPr>
             <w:r>
               <w:rPr>
@@ -3614,7 +3735,21 @@
                 <w:sz w:val="18"/>
                 <w:szCs w:val="18"/>
               </w:rPr>
-              <w:t xml:space="preserve">print(x)</w:t>
+              <w:t xml:space="preserve">count+=1</w:t>
+            </w:r>
+          </w:p>
+          <w:p>
+            <w:pPr>
+              <w:spacing w:after="0" w:line="216" w:lineRule="exact"/>
+              <w:ind w:left="180"/>
+            </w:pPr>
+            <w:r>
+              <w:rPr>
+                <w:rFonts w:ascii="Courier New" w:hAnsi="Courier New" w:cs="Courier New"/>
+                <w:sz w:val="18"/>
+                <w:szCs w:val="18"/>
+              </w:rPr>
+              <w:t xml:space="preserve">print(x,count)</w:t>
             </w:r>
           </w:p>
           <w:p>
@@ -3631,7 +3766,7 @@
                 <w:sz w:val="20"/>
                 <w:szCs w:val="20"/>
               </w:rPr>
-              <w:t xml:space="preserve">(A) 12</w:t>
+              <w:t xml:space="preserve">(a) 5 5</w:t>
             </w:r>
             <w:r>
               <w:rPr>
@@ -3647,7 +3782,7 @@
                 <w:sz w:val="20"/>
                 <w:szCs w:val="20"/>
               </w:rPr>
-              <w:t xml:space="preserve">(B) 14</w:t>
+              <w:t xml:space="preserve">(b) 0 5</w:t>
             </w:r>
             <w:r>
               <w:rPr>
@@ -3663,7 +3798,7 @@
                 <w:sz w:val="20"/>
                 <w:szCs w:val="20"/>
               </w:rPr>
-              <w:t xml:space="preserve">(C) 10</w:t>
+              <w:t xml:space="preserve">(c) 1 5</w:t>
             </w:r>
           </w:p>
           <w:p>
@@ -3680,7 +3815,7 @@
                 <w:sz w:val="20"/>
                 <w:szCs w:val="20"/>
               </w:rPr>
-              <w:t xml:space="preserve">(D) 11</w:t>
+              <w:t xml:space="preserve">(d) 15 5</w:t>
             </w:r>
             <w:r>
               <w:rPr>
@@ -3696,7 +3831,7 @@
                 <w:sz w:val="20"/>
                 <w:szCs w:val="20"/>
               </w:rPr>
-              <w:t xml:space="preserve">(E) 0</w:t>
+              <w:t xml:space="preserve">(e) Error</w:t>
             </w:r>
             <w:r>
               <w:rPr>
@@ -3712,7 +3847,7 @@
                 <w:sz w:val="20"/>
                 <w:szCs w:val="20"/>
               </w:rPr>
-              <w:t xml:space="preserve">(F) 15</w:t>
+              <w:t xml:space="preserve">(f) None of the above</w:t>
             </w:r>
           </w:p>
         </w:tc>
@@ -3768,14 +3903,14 @@
                 <w:sz w:val="20"/>
                 <w:szCs w:val="20"/>
               </w:rPr>
-              <w:t xml:space="preserve">A</w:t>
+              <w:t xml:space="preserve">N</w:t>
             </w:r>
           </w:p>
         </w:tc>
       </w:tr>
       <w:tr>
         <w:trPr>
-          <w:trHeight w:val="240"/>
+          <w:trHeight w:val="677"/>
         </w:trPr>
         <w:tc>
           <w:tcPr>
@@ -3827,7 +3962,7 @@
                 <w:sz w:val="22"/>
                 <w:szCs w:val="22"/>
               </w:rPr>
-              <w:t xml:space="preserve">9)</w:t>
+              <w:t xml:space="preserve">8)</w:t>
             </w:r>
           </w:p>
         </w:tc>
@@ -3845,7 +3980,7 @@
                 <w:sz w:val="22"/>
                 <w:szCs w:val="22"/>
               </w:rPr>
-              <w:t xml:space="preserve">What is the output of the following code?</w:t>
+              <w:t xml:space="preserve">What will be the output of the following program on execution?</w:t>
             </w:r>
           </w:p>
           <w:p>
@@ -3859,7 +3994,7 @@
                 <w:sz w:val="18"/>
                 <w:szCs w:val="18"/>
               </w:rPr>
-              <w:t xml:space="preserve">n=10</w:t>
+              <w:t xml:space="preserve">a=0</w:t>
             </w:r>
           </w:p>
           <w:p>
@@ -3873,7 +4008,7 @@
                 <w:sz w:val="18"/>
                 <w:szCs w:val="18"/>
               </w:rPr>
-              <w:t xml:space="preserve">i=1</w:t>
+              <w:t xml:space="preserve">b=6</w:t>
             </w:r>
           </w:p>
           <w:p>
@@ -3887,13 +4022,13 @@
                 <w:sz w:val="18"/>
                 <w:szCs w:val="18"/>
               </w:rPr>
-              <w:t xml:space="preserve">while(i&lt;=n):</w:t>
+              <w:t xml:space="preserve">x=(a or b) or ((a and a) or (a and b))</w:t>
             </w:r>
           </w:p>
           <w:p>
             <w:pPr>
               <w:spacing w:after="0" w:line="216" w:lineRule="exact"/>
-              <w:ind w:left="360"/>
+              <w:ind w:left="180"/>
             </w:pPr>
             <w:r>
               <w:rPr>
@@ -3901,133 +4036,7 @@
                 <w:sz w:val="18"/>
                 <w:szCs w:val="18"/>
               </w:rPr>
-              <w:t xml:space="preserve">k=0</w:t>
-            </w:r>
-          </w:p>
-          <w:p>
-            <w:pPr>
-              <w:spacing w:after="0" w:line="216" w:lineRule="exact"/>
-              <w:ind w:left="360"/>
-            </w:pPr>
-            <w:r>
-              <w:rPr>
-                <w:rFonts w:ascii="Courier New" w:hAnsi="Courier New" w:cs="Courier New"/>
-                <w:sz w:val="18"/>
-                <w:szCs w:val="18"/>
-              </w:rPr>
-              <w:t xml:space="preserve">if(n%i==0):</w:t>
-            </w:r>
-          </w:p>
-          <w:p>
-            <w:pPr>
-              <w:spacing w:after="0" w:line="216" w:lineRule="exact"/>
-              <w:ind w:left="540"/>
-            </w:pPr>
-            <w:r>
-              <w:rPr>
-                <w:rFonts w:ascii="Courier New" w:hAnsi="Courier New" w:cs="Courier New"/>
-                <w:sz w:val="18"/>
-                <w:szCs w:val="18"/>
-              </w:rPr>
-              <w:t xml:space="preserve">j=1</w:t>
-            </w:r>
-          </w:p>
-          <w:p>
-            <w:pPr>
-              <w:spacing w:after="0" w:line="216" w:lineRule="exact"/>
-              <w:ind w:left="540"/>
-            </w:pPr>
-            <w:r>
-              <w:rPr>
-                <w:rFonts w:ascii="Courier New" w:hAnsi="Courier New" w:cs="Courier New"/>
-                <w:sz w:val="18"/>
-                <w:szCs w:val="18"/>
-              </w:rPr>
-              <w:t xml:space="preserve">while(j&lt;=i):</w:t>
-            </w:r>
-          </w:p>
-          <w:p>
-            <w:pPr>
-              <w:spacing w:after="0" w:line="216" w:lineRule="exact"/>
-              <w:ind w:left="720"/>
-            </w:pPr>
-            <w:r>
-              <w:rPr>
-                <w:rFonts w:ascii="Courier New" w:hAnsi="Courier New" w:cs="Courier New"/>
-                <w:sz w:val="18"/>
-                <w:szCs w:val="18"/>
-              </w:rPr>
-              <w:t xml:space="preserve">if(i%j==0):</w:t>
-            </w:r>
-          </w:p>
-          <w:p>
-            <w:pPr>
-              <w:spacing w:after="0" w:line="216" w:lineRule="exact"/>
-              <w:ind w:left="900"/>
-            </w:pPr>
-            <w:r>
-              <w:rPr>
-                <w:rFonts w:ascii="Courier New" w:hAnsi="Courier New" w:cs="Courier New"/>
-                <w:sz w:val="18"/>
-                <w:szCs w:val="18"/>
-              </w:rPr>
-              <w:t xml:space="preserve">k=k+1</w:t>
-            </w:r>
-          </w:p>
-          <w:p>
-            <w:pPr>
-              <w:spacing w:after="0" w:line="216" w:lineRule="exact"/>
-              <w:ind w:left="720"/>
-            </w:pPr>
-            <w:r>
-              <w:rPr>
-                <w:rFonts w:ascii="Courier New" w:hAnsi="Courier New" w:cs="Courier New"/>
-                <w:sz w:val="18"/>
-                <w:szCs w:val="18"/>
-              </w:rPr>
-              <w:t xml:space="preserve">j=j+1</w:t>
-            </w:r>
-          </w:p>
-          <w:p>
-            <w:pPr>
-              <w:spacing w:after="0" w:line="216" w:lineRule="exact"/>
-              <w:ind w:left="540"/>
-            </w:pPr>
-            <w:r>
-              <w:rPr>
-                <w:rFonts w:ascii="Courier New" w:hAnsi="Courier New" w:cs="Courier New"/>
-                <w:sz w:val="18"/>
-                <w:szCs w:val="18"/>
-              </w:rPr>
-              <w:t xml:space="preserve">if(k==2):</w:t>
-            </w:r>
-          </w:p>
-          <w:p>
-            <w:pPr>
-              <w:spacing w:after="0" w:line="216" w:lineRule="exact"/>
-              <w:ind w:left="720"/>
-            </w:pPr>
-            <w:r>
-              <w:rPr>
-                <w:rFonts w:ascii="Courier New" w:hAnsi="Courier New" w:cs="Courier New"/>
-                <w:sz w:val="18"/>
-                <w:szCs w:val="18"/>
-              </w:rPr>
-              <w:t xml:space="preserve">print(i,end=" ")</w:t>
-            </w:r>
-          </w:p>
-          <w:p>
-            <w:pPr>
-              <w:spacing w:after="0" w:line="216" w:lineRule="exact"/>
-              <w:ind w:left="360"/>
-            </w:pPr>
-            <w:r>
-              <w:rPr>
-                <w:rFonts w:ascii="Courier New" w:hAnsi="Courier New" w:cs="Courier New"/>
-                <w:sz w:val="18"/>
-                <w:szCs w:val="18"/>
-              </w:rPr>
-              <w:t xml:space="preserve">i=i+1</w:t>
+              <w:t xml:space="preserve">print(x)</w:t>
             </w:r>
           </w:p>
           <w:p>
@@ -4044,7 +4053,7 @@
                 <w:sz w:val="20"/>
                 <w:szCs w:val="20"/>
               </w:rPr>
-              <w:t xml:space="preserve">(A) 1 2 5 10</w:t>
+              <w:t xml:space="preserve">(a) 0</w:t>
             </w:r>
             <w:r>
               <w:rPr>
@@ -4060,7 +4069,7 @@
                 <w:sz w:val="20"/>
                 <w:szCs w:val="20"/>
               </w:rPr>
-              <w:t xml:space="preserve">(B) 5 10</w:t>
+              <w:t xml:space="preserve">(b) True</w:t>
             </w:r>
             <w:r>
               <w:rPr>
@@ -4076,7 +4085,7 @@
                 <w:sz w:val="20"/>
                 <w:szCs w:val="20"/>
               </w:rPr>
-              <w:t xml:space="preserve">(C) 2 5 10</w:t>
+              <w:t xml:space="preserve">(c) False</w:t>
             </w:r>
           </w:p>
           <w:p>
@@ -4093,7 +4102,7 @@
                 <w:sz w:val="20"/>
                 <w:szCs w:val="20"/>
               </w:rPr>
-              <w:t xml:space="preserve">(D) 2 3 5 7</w:t>
+              <w:t xml:space="preserve">(d) 6</w:t>
             </w:r>
             <w:r>
               <w:rPr>
@@ -4109,7 +4118,7 @@
                 <w:sz w:val="20"/>
                 <w:szCs w:val="20"/>
               </w:rPr>
-              <w:t xml:space="preserve">(E) 2 5</w:t>
+              <w:t xml:space="preserve">(e) Error</w:t>
             </w:r>
             <w:r>
               <w:rPr>
@@ -4125,7 +4134,7 @@
                 <w:sz w:val="20"/>
                 <w:szCs w:val="20"/>
               </w:rPr>
-              <w:t xml:space="preserve">(F) 10 20</w:t>
+              <w:t xml:space="preserve">(f) None of the above</w:t>
             </w:r>
           </w:p>
         </w:tc>
@@ -4181,14 +4190,14 @@
                 <w:sz w:val="20"/>
                 <w:szCs w:val="20"/>
               </w:rPr>
-              <w:t xml:space="preserve">N</w:t>
+              <w:t xml:space="preserve">A</w:t>
             </w:r>
           </w:p>
         </w:tc>
       </w:tr>
       <w:tr>
         <w:trPr>
-          <w:trHeight w:val="240"/>
+          <w:trHeight w:val="677"/>
         </w:trPr>
         <w:tc>
           <w:tcPr>
@@ -4240,7 +4249,7 @@
                 <w:sz w:val="22"/>
                 <w:szCs w:val="22"/>
               </w:rPr>
-              <w:t xml:space="preserve">10)</w:t>
+              <w:t xml:space="preserve">9)</w:t>
             </w:r>
           </w:p>
         </w:tc>
@@ -4258,189 +4267,7 @@
                 <w:sz w:val="22"/>
                 <w:szCs w:val="22"/>
               </w:rPr>
-              <w:t xml:space="preserve">What will be the output of the following program on execution?</w:t>
-            </w:r>
-          </w:p>
-          <w:p>
-            <w:pPr>
-              <w:spacing w:after="0" w:line="216" w:lineRule="exact"/>
-              <w:ind w:left="180"/>
-            </w:pPr>
-            <w:r>
-              <w:rPr>
-                <w:rFonts w:ascii="Courier New" w:hAnsi="Courier New" w:cs="Courier New"/>
-                <w:sz w:val="18"/>
-                <w:szCs w:val="18"/>
-              </w:rPr>
-              <w:t xml:space="preserve">x=0</w:t>
-            </w:r>
-          </w:p>
-          <w:p>
-            <w:pPr>
-              <w:spacing w:after="0" w:line="216" w:lineRule="exact"/>
-              <w:ind w:left="180"/>
-            </w:pPr>
-            <w:r>
-              <w:rPr>
-                <w:rFonts w:ascii="Courier New" w:hAnsi="Courier New" w:cs="Courier New"/>
-                <w:sz w:val="18"/>
-                <w:szCs w:val="18"/>
-              </w:rPr>
-              <w:t xml:space="preserve">count=0</w:t>
-            </w:r>
-          </w:p>
-          <w:p>
-            <w:pPr>
-              <w:spacing w:after="0" w:line="216" w:lineRule="exact"/>
-              <w:ind w:left="180"/>
-            </w:pPr>
-            <w:r>
-              <w:rPr>
-                <w:rFonts w:ascii="Courier New" w:hAnsi="Courier New" w:cs="Courier New"/>
-                <w:sz w:val="18"/>
-                <w:szCs w:val="18"/>
-              </w:rPr>
-              <w:t xml:space="preserve">while x&lt;15:</w:t>
-            </w:r>
-          </w:p>
-          <w:p>
-            <w:pPr>
-              <w:spacing w:after="0" w:line="216" w:lineRule="exact"/>
-              <w:ind w:left="360"/>
-            </w:pPr>
-            <w:r>
-              <w:rPr>
-                <w:rFonts w:ascii="Courier New" w:hAnsi="Courier New" w:cs="Courier New"/>
-                <w:sz w:val="18"/>
-                <w:szCs w:val="18"/>
-              </w:rPr>
-              <w:t xml:space="preserve">if x%2==0:</w:t>
-            </w:r>
-          </w:p>
-          <w:p>
-            <w:pPr>
-              <w:spacing w:after="0" w:line="216" w:lineRule="exact"/>
-              <w:ind w:left="540"/>
-            </w:pPr>
-            <w:r>
-              <w:rPr>
-                <w:rFonts w:ascii="Courier New" w:hAnsi="Courier New" w:cs="Courier New"/>
-                <w:sz w:val="18"/>
-                <w:szCs w:val="18"/>
-              </w:rPr>
-              <w:t xml:space="preserve">x+=1</w:t>
-            </w:r>
-          </w:p>
-          <w:p>
-            <w:pPr>
-              <w:spacing w:after="0" w:line="216" w:lineRule="exact"/>
-              <w:ind w:left="540"/>
-            </w:pPr>
-            <w:r>
-              <w:rPr>
-                <w:rFonts w:ascii="Courier New" w:hAnsi="Courier New" w:cs="Courier New"/>
-                <w:sz w:val="18"/>
-                <w:szCs w:val="18"/>
-              </w:rPr>
-              <w:t xml:space="preserve">continue</w:t>
-            </w:r>
-          </w:p>
-          <w:p>
-            <w:pPr>
-              <w:spacing w:after="0" w:line="216" w:lineRule="exact"/>
-              <w:ind w:left="360"/>
-            </w:pPr>
-            <w:r>
-              <w:rPr>
-                <w:rFonts w:ascii="Courier New" w:hAnsi="Courier New" w:cs="Courier New"/>
-                <w:sz w:val="18"/>
-                <w:szCs w:val="18"/>
-              </w:rPr>
-              <w:t xml:space="preserve">if x%3==0:</w:t>
-            </w:r>
-          </w:p>
-          <w:p>
-            <w:pPr>
-              <w:spacing w:after="0" w:line="216" w:lineRule="exact"/>
-              <w:ind w:left="540"/>
-            </w:pPr>
-            <w:r>
-              <w:rPr>
-                <w:rFonts w:ascii="Courier New" w:hAnsi="Courier New" w:cs="Courier New"/>
-                <w:sz w:val="18"/>
-                <w:szCs w:val="18"/>
-              </w:rPr>
-              <w:t xml:space="preserve">x+=1</w:t>
-            </w:r>
-          </w:p>
-          <w:p>
-            <w:pPr>
-              <w:spacing w:after="0" w:line="216" w:lineRule="exact"/>
-              <w:ind w:left="540"/>
-            </w:pPr>
-            <w:r>
-              <w:rPr>
-                <w:rFonts w:ascii="Courier New" w:hAnsi="Courier New" w:cs="Courier New"/>
-                <w:sz w:val="18"/>
-                <w:szCs w:val="18"/>
-              </w:rPr>
-              <w:t xml:space="preserve">continue</w:t>
-            </w:r>
-          </w:p>
-          <w:p>
-            <w:pPr>
-              <w:spacing w:after="0" w:line="216" w:lineRule="exact"/>
-              <w:ind w:left="360"/>
-            </w:pPr>
-            <w:r>
-              <w:rPr>
-                <w:rFonts w:ascii="Courier New" w:hAnsi="Courier New" w:cs="Courier New"/>
-                <w:sz w:val="18"/>
-                <w:szCs w:val="18"/>
-              </w:rPr>
-              <w:t xml:space="preserve">if count==5:</w:t>
-            </w:r>
-          </w:p>
-          <w:p>
-            <w:pPr>
-              <w:spacing w:after="0" w:line="216" w:lineRule="exact"/>
-              <w:ind w:left="540"/>
-            </w:pPr>
-            <w:r>
-              <w:rPr>
-                <w:rFonts w:ascii="Courier New" w:hAnsi="Courier New" w:cs="Courier New"/>
-                <w:sz w:val="18"/>
-                <w:szCs w:val="18"/>
-              </w:rPr>
-              <w:t xml:space="preserve">break</w:t>
-            </w:r>
-          </w:p>
-          <w:p>
-            <w:pPr>
-              <w:spacing w:after="0" w:line="216" w:lineRule="exact"/>
-              <w:ind w:left="360"/>
-            </w:pPr>
-            <w:r>
-              <w:rPr>
-                <w:rFonts w:ascii="Courier New" w:hAnsi="Courier New" w:cs="Courier New"/>
-                <w:sz w:val="18"/>
-                <w:szCs w:val="18"/>
-              </w:rPr>
-              <w:t xml:space="preserve">count+=1</w:t>
-            </w:r>
-          </w:p>
-          <w:p>
-            <w:pPr>
-              <w:spacing w:after="0" w:line="216" w:lineRule="exact"/>
-              <w:ind w:left="180"/>
-            </w:pPr>
-            <w:r>
-              <w:rPr>
-                <w:rFonts w:ascii="Courier New" w:hAnsi="Courier New" w:cs="Courier New"/>
-                <w:sz w:val="18"/>
-                <w:szCs w:val="18"/>
-              </w:rPr>
-              <w:t xml:space="preserve">print(x,count)</w:t>
+              <w:t xml:space="preserve">A program that reads each of the instructions in mnemonic form and translates it into the machine-language equivalent is ______</w:t>
             </w:r>
           </w:p>
           <w:p>
@@ -4457,7 +4284,7 @@
                 <w:sz w:val="20"/>
                 <w:szCs w:val="20"/>
               </w:rPr>
-              <w:t xml:space="preserve">(A) 0 5</w:t>
+              <w:t xml:space="preserve">(a) Machine language</w:t>
             </w:r>
             <w:r>
               <w:rPr>
@@ -4473,7 +4300,7 @@
                 <w:sz w:val="20"/>
                 <w:szCs w:val="20"/>
               </w:rPr>
-              <w:t xml:space="preserve">(B) 1 5</w:t>
+              <w:t xml:space="preserve">(b) Interpreter</w:t>
             </w:r>
             <w:r>
               <w:rPr>
@@ -4489,7 +4316,7 @@
                 <w:sz w:val="20"/>
                 <w:szCs w:val="20"/>
               </w:rPr>
-              <w:t xml:space="preserve">(C) 14 5</w:t>
+              <w:t xml:space="preserve">(c) Assembler</w:t>
             </w:r>
           </w:p>
           <w:p>
@@ -4506,7 +4333,7 @@
                 <w:sz w:val="20"/>
                 <w:szCs w:val="20"/>
               </w:rPr>
-              <w:t xml:space="preserve">(D) 15 5</w:t>
+              <w:t xml:space="preserve">(d) Compiler</w:t>
             </w:r>
             <w:r>
               <w:rPr>
@@ -4522,7 +4349,7 @@
                 <w:sz w:val="20"/>
                 <w:szCs w:val="20"/>
               </w:rPr>
-              <w:t xml:space="preserve">(E) 5 5</w:t>
+              <w:t xml:space="preserve">(e) Linker</w:t>
             </w:r>
             <w:r>
               <w:rPr>
@@ -4538,7 +4365,7 @@
                 <w:sz w:val="20"/>
                 <w:szCs w:val="20"/>
               </w:rPr>
-              <w:t xml:space="preserve">(F) 16 5</w:t>
+              <w:t xml:space="preserve">(f) Loader</w:t>
             </w:r>
           </w:p>
         </w:tc>
@@ -4594,14 +4421,14 @@
                 <w:sz w:val="20"/>
                 <w:szCs w:val="20"/>
               </w:rPr>
-              <w:t xml:space="preserve">N</w:t>
+              <w:t xml:space="preserve">U</w:t>
             </w:r>
           </w:p>
         </w:tc>
       </w:tr>
       <w:tr>
         <w:trPr>
-          <w:trHeight w:val="240"/>
+          <w:trHeight w:val="677"/>
         </w:trPr>
         <w:tc>
           <w:tcPr>
@@ -4626,7 +4453,7 @@
                 <w:sz w:val="22"/>
                 <w:szCs w:val="22"/>
               </w:rPr>
-              <w:t xml:space="preserve">Q-2</w:t>
+              <w:t xml:space="preserve"/>
             </w:r>
           </w:p>
         </w:tc>
@@ -4653,7 +4480,7 @@
                 <w:sz w:val="22"/>
                 <w:szCs w:val="22"/>
               </w:rPr>
-              <w:t xml:space="preserve">1)</w:t>
+              <w:t xml:space="preserve">10)</w:t>
             </w:r>
           </w:p>
         </w:tc>
@@ -4671,7 +4498,7 @@
                 <w:sz w:val="22"/>
                 <w:szCs w:val="22"/>
               </w:rPr>
-              <w:t xml:space="preserve">A student creates a new Jupyter Notebook and types the following code in three different cells:</w:t>
+              <w:t xml:space="preserve">What will be the output of the following algorithm if the input is 4?</w:t>
             </w:r>
           </w:p>
           <w:p>
@@ -4685,7 +4512,7 @@
                 <w:sz w:val="18"/>
                 <w:szCs w:val="18"/>
               </w:rPr>
-              <w:t xml:space="preserve">Cell-1 :  n = 7</w:t>
+              <w:t xml:space="preserve">Algorithm:</w:t>
             </w:r>
           </w:p>
           <w:p>
@@ -4699,7 +4526,7 @@
                 <w:sz w:val="18"/>
                 <w:szCs w:val="18"/>
               </w:rPr>
-              <w:t xml:space="preserve">Cell-2 :  n = n * 3</w:t>
+              <w:t xml:space="preserve">1. Start</w:t>
             </w:r>
           </w:p>
           <w:p>
@@ -4713,46 +4540,147 @@
                 <w:sz w:val="18"/>
                 <w:szCs w:val="18"/>
               </w:rPr>
-              <w:t xml:space="preserve">Cell-3 :  print(n, type(n))</w:t>
-            </w:r>
-          </w:p>
-          <w:p>
-            <w:pPr>
-              <w:spacing w:after="0" w:line="240" w:lineRule="auto"/>
-            </w:pPr>
-            <w:r>
-              <w:rPr>
-                <w:rFonts w:ascii="Times New Roman" w:hAnsi="Times New Roman" w:cs="Times New Roman"/>
-                <w:sz w:val="22"/>
-                <w:szCs w:val="22"/>
-              </w:rPr>
-              <w:t xml:space="preserve">The student runs Cell-3 first, then Cell-1, then Cell-2 and finally runs Cell-3 once again.</w:t>
-            </w:r>
-          </w:p>
-          <w:p>
-            <w:pPr>
-              <w:spacing w:after="0" w:line="240" w:lineRule="auto"/>
-            </w:pPr>
-            <w:r>
-              <w:rPr>
-                <w:rFonts w:ascii="Times New Roman" w:hAnsi="Times New Roman" w:cs="Times New Roman"/>
-                <w:sz w:val="22"/>
-                <w:szCs w:val="22"/>
-              </w:rPr>
-              <w:t xml:space="preserve">(a) State exactly what is displayed by each of the two executions of Cell-3.</w:t>
-            </w:r>
-          </w:p>
-          <w:p>
-            <w:pPr>
-              <w:spacing w:after="0" w:line="240" w:lineRule="auto"/>
-            </w:pPr>
-            <w:r>
-              <w:rPr>
-                <w:rFonts w:ascii="Times New Roman" w:hAnsi="Times New Roman" w:cs="Times New Roman"/>
-                <w:sz w:val="22"/>
-                <w:szCs w:val="22"/>
-              </w:rPr>
-              <w:t xml:space="preserve">(b) Explain the reason for the difference between the two outputs and state the corrective steps that give the intended output.</w:t>
+              <w:t xml:space="preserve">2. Set x = input value</w:t>
+            </w:r>
+          </w:p>
+          <w:p>
+            <w:pPr>
+              <w:spacing w:after="0" w:line="216" w:lineRule="exact"/>
+              <w:ind w:left="180"/>
+            </w:pPr>
+            <w:r>
+              <w:rPr>
+                <w:rFonts w:ascii="Courier New" w:hAnsi="Courier New" w:cs="Courier New"/>
+                <w:sz w:val="18"/>
+                <w:szCs w:val="18"/>
+              </w:rPr>
+              <w:t xml:space="preserve">3. Set y = x * 2</w:t>
+            </w:r>
+          </w:p>
+          <w:p>
+            <w:pPr>
+              <w:spacing w:after="0" w:line="216" w:lineRule="exact"/>
+              <w:ind w:left="180"/>
+            </w:pPr>
+            <w:r>
+              <w:rPr>
+                <w:rFonts w:ascii="Courier New" w:hAnsi="Courier New" w:cs="Courier New"/>
+                <w:sz w:val="18"/>
+                <w:szCs w:val="18"/>
+              </w:rPr>
+              <w:t xml:space="preserve">4. If y &gt; 5, then print "Large", otherwise print "Small".</w:t>
+            </w:r>
+          </w:p>
+          <w:p>
+            <w:pPr>
+              <w:spacing w:after="0" w:line="216" w:lineRule="exact"/>
+              <w:ind w:left="180"/>
+            </w:pPr>
+            <w:r>
+              <w:rPr>
+                <w:rFonts w:ascii="Courier New" w:hAnsi="Courier New" w:cs="Courier New"/>
+                <w:sz w:val="18"/>
+                <w:szCs w:val="18"/>
+              </w:rPr>
+              <w:t xml:space="preserve">5. Stop</w:t>
+            </w:r>
+          </w:p>
+          <w:p>
+            <w:pPr>
+              <w:tabs>
+                <w:tab w:val="left" w:pos="2800"/>
+                <w:tab w:val="left" w:pos="5600"/>
+              </w:tabs>
+              <w:spacing w:after="0" w:line="240" w:lineRule="auto"/>
+            </w:pPr>
+            <w:r>
+              <w:rPr>
+                <w:rFonts w:ascii="Times New Roman" w:hAnsi="Times New Roman" w:cs="Times New Roman"/>
+                <w:sz w:val="20"/>
+                <w:szCs w:val="20"/>
+              </w:rPr>
+              <w:t xml:space="preserve">(a) Small</w:t>
+            </w:r>
+            <w:r>
+              <w:rPr>
+                <w:rFonts w:ascii="Times New Roman" w:hAnsi="Times New Roman" w:cs="Times New Roman"/>
+                <w:sz w:val="20"/>
+                <w:szCs w:val="20"/>
+              </w:rPr>
+              <w:tab/>
+            </w:r>
+            <w:r>
+              <w:rPr>
+                <w:rFonts w:ascii="Times New Roman" w:hAnsi="Times New Roman" w:cs="Times New Roman"/>
+                <w:sz w:val="20"/>
+                <w:szCs w:val="20"/>
+              </w:rPr>
+              <w:t xml:space="preserve">(b) Large</w:t>
+            </w:r>
+            <w:r>
+              <w:rPr>
+                <w:rFonts w:ascii="Times New Roman" w:hAnsi="Times New Roman" w:cs="Times New Roman"/>
+                <w:sz w:val="20"/>
+                <w:szCs w:val="20"/>
+              </w:rPr>
+              <w:tab/>
+            </w:r>
+            <w:r>
+              <w:rPr>
+                <w:rFonts w:ascii="Times New Roman" w:hAnsi="Times New Roman" w:cs="Times New Roman"/>
+                <w:sz w:val="20"/>
+                <w:szCs w:val="20"/>
+              </w:rPr>
+              <w:t xml:space="preserve">(c) 8</w:t>
+            </w:r>
+          </w:p>
+          <w:p>
+            <w:pPr>
+              <w:tabs>
+                <w:tab w:val="left" w:pos="2800"/>
+                <w:tab w:val="left" w:pos="5600"/>
+              </w:tabs>
+              <w:spacing w:after="0" w:line="240" w:lineRule="auto"/>
+            </w:pPr>
+            <w:r>
+              <w:rPr>
+                <w:rFonts w:ascii="Times New Roman" w:hAnsi="Times New Roman" w:cs="Times New Roman"/>
+                <w:sz w:val="20"/>
+                <w:szCs w:val="20"/>
+              </w:rPr>
+              <w:t xml:space="preserve">(d) 4</w:t>
+            </w:r>
+            <w:r>
+              <w:rPr>
+                <w:rFonts w:ascii="Times New Roman" w:hAnsi="Times New Roman" w:cs="Times New Roman"/>
+                <w:sz w:val="20"/>
+                <w:szCs w:val="20"/>
+              </w:rPr>
+              <w:tab/>
+            </w:r>
+            <w:r>
+              <w:rPr>
+                <w:rFonts w:ascii="Times New Roman" w:hAnsi="Times New Roman" w:cs="Times New Roman"/>
+                <w:sz w:val="20"/>
+                <w:szCs w:val="20"/>
+              </w:rPr>
+              <w:t xml:space="preserve">(e) Error</w:t>
+            </w:r>
+            <w:r>
+              <w:rPr>
+                <w:rFonts w:ascii="Times New Roman" w:hAnsi="Times New Roman" w:cs="Times New Roman"/>
+                <w:sz w:val="20"/>
+                <w:szCs w:val="20"/>
+              </w:rPr>
+              <w:tab/>
+            </w:r>
+            <w:r>
+              <w:rPr>
+                <w:rFonts w:ascii="Times New Roman" w:hAnsi="Times New Roman" w:cs="Times New Roman"/>
+                <w:sz w:val="20"/>
+                <w:szCs w:val="20"/>
+              </w:rPr>
+              <w:t xml:space="preserve">(f) None of the above</w:t>
             </w:r>
           </w:p>
         </w:tc>
@@ -4780,7 +4708,7 @@
                 <w:sz w:val="20"/>
                 <w:szCs w:val="20"/>
               </w:rPr>
-              <w:t xml:space="preserve">3</w:t>
+              <w:t xml:space="preserve">1</w:t>
             </w:r>
           </w:p>
         </w:tc>
@@ -4808,14 +4736,229 @@
                 <w:sz w:val="20"/>
                 <w:szCs w:val="20"/>
               </w:rPr>
-              <w:t xml:space="preserve">U</w:t>
+              <w:t xml:space="preserve">A</w:t>
             </w:r>
           </w:p>
         </w:tc>
       </w:tr>
       <w:tr>
         <w:trPr>
-          <w:trHeight w:val="240"/>
+          <w:trHeight w:val="677"/>
+        </w:trPr>
+        <w:tc>
+          <w:tcPr>
+            <w:tcW w:w="642" w:type="dxa"/>
+          </w:tcPr>
+          <w:p>
+            <w:pPr>
+              <w:spacing w:after="0" w:line="240" w:lineRule="auto"/>
+              <w:rPr>
+                <w:rFonts w:ascii="Times New Roman" w:hAnsi="Times New Roman"/>
+                <w:b/>
+                <w:bCs/>
+                <w:sz w:val="24"/>
+                <w:szCs w:val="24"/>
+              </w:rPr>
+            </w:pPr>
+            <w:r>
+              <w:rPr>
+                <w:rFonts w:ascii="Times New Roman" w:hAnsi="Times New Roman" w:cs="Times New Roman"/>
+                <w:b/>
+                <w:bCs/>
+                <w:sz w:val="22"/>
+                <w:szCs w:val="22"/>
+              </w:rPr>
+              <w:t xml:space="preserve">Q-2</w:t>
+            </w:r>
+          </w:p>
+        </w:tc>
+        <w:tc>
+          <w:tcPr>
+            <w:tcW w:w="497" w:type="dxa"/>
+          </w:tcPr>
+          <w:p>
+            <w:pPr>
+              <w:spacing w:after="0" w:line="240" w:lineRule="auto"/>
+              <w:rPr>
+                <w:rFonts w:ascii="Times New Roman" w:hAnsi="Times New Roman"/>
+                <w:b/>
+                <w:bCs/>
+                <w:sz w:val="24"/>
+                <w:szCs w:val="24"/>
+              </w:rPr>
+            </w:pPr>
+            <w:r>
+              <w:rPr>
+                <w:rFonts w:ascii="Times New Roman" w:hAnsi="Times New Roman" w:cs="Times New Roman"/>
+                <w:b/>
+                <w:bCs/>
+                <w:sz w:val="22"/>
+                <w:szCs w:val="22"/>
+              </w:rPr>
+              <w:t xml:space="preserve">1)</w:t>
+            </w:r>
+          </w:p>
+        </w:tc>
+        <w:tc>
+          <w:tcPr>
+            <w:tcW w:w="8396" w:type="dxa"/>
+          </w:tcPr>
+          <w:p>
+            <w:pPr>
+              <w:spacing w:after="0" w:line="240" w:lineRule="auto"/>
+            </w:pPr>
+            <w:r>
+              <w:rPr>
+                <w:rFonts w:ascii="Times New Roman" w:hAnsi="Times New Roman" w:cs="Times New Roman"/>
+                <w:sz w:val="22"/>
+                <w:szCs w:val="22"/>
+              </w:rPr>
+              <w:t xml:space="preserve">The following statements are executed in one cell of a Jupyter Notebook:</w:t>
+            </w:r>
+          </w:p>
+          <w:p>
+            <w:pPr>
+              <w:spacing w:after="0" w:line="216" w:lineRule="exact"/>
+              <w:ind w:left="180"/>
+            </w:pPr>
+            <w:r>
+              <w:rPr>
+                <w:rFonts w:ascii="Courier New" w:hAnsi="Courier New" w:cs="Courier New"/>
+                <w:sz w:val="18"/>
+                <w:szCs w:val="18"/>
+              </w:rPr>
+              <w:t xml:space="preserve">total = 7 / 2</w:t>
+            </w:r>
+          </w:p>
+          <w:p>
+            <w:pPr>
+              <w:spacing w:after="0" w:line="216" w:lineRule="exact"/>
+              <w:ind w:left="180"/>
+            </w:pPr>
+            <w:r>
+              <w:rPr>
+                <w:rFonts w:ascii="Courier New" w:hAnsi="Courier New" w:cs="Courier New"/>
+                <w:sz w:val="18"/>
+                <w:szCs w:val="18"/>
+              </w:rPr>
+              <w:t xml:space="preserve">count = int(total)</w:t>
+            </w:r>
+          </w:p>
+          <w:p>
+            <w:pPr>
+              <w:spacing w:after="0" w:line="216" w:lineRule="exact"/>
+              <w:ind w:left="180"/>
+            </w:pPr>
+            <w:r>
+              <w:rPr>
+                <w:rFonts w:ascii="Courier New" w:hAnsi="Courier New" w:cs="Courier New"/>
+                <w:sz w:val="18"/>
+                <w:szCs w:val="18"/>
+              </w:rPr>
+              <w:t xml:space="preserve">result = count ** 2 + 9 % 4</w:t>
+            </w:r>
+          </w:p>
+          <w:p>
+            <w:pPr>
+              <w:spacing w:after="0" w:line="216" w:lineRule="exact"/>
+              <w:ind w:left="180"/>
+            </w:pPr>
+            <w:r>
+              <w:rPr>
+                <w:rFonts w:ascii="Courier New" w:hAnsi="Courier New" w:cs="Courier New"/>
+                <w:sz w:val="18"/>
+                <w:szCs w:val="18"/>
+              </w:rPr>
+              <w:t xml:space="preserve">print(result, type(result), type(total))</w:t>
+            </w:r>
+          </w:p>
+          <w:p>
+            <w:pPr>
+              <w:spacing w:after="0" w:line="240" w:lineRule="auto"/>
+            </w:pPr>
+            <w:r>
+              <w:rPr>
+                <w:rFonts w:ascii="Times New Roman" w:hAnsi="Times New Roman" w:cs="Times New Roman"/>
+                <w:sz w:val="22"/>
+                <w:szCs w:val="22"/>
+              </w:rPr>
+              <w:t xml:space="preserve">(i)  Write the exact output produced by the cell.</w:t>
+            </w:r>
+          </w:p>
+          <w:p>
+            <w:pPr>
+              <w:spacing w:after="0" w:line="240" w:lineRule="auto"/>
+            </w:pPr>
+            <w:r>
+              <w:rPr>
+                <w:rFonts w:ascii="Times New Roman" w:hAnsi="Times New Roman" w:cs="Times New Roman"/>
+                <w:sz w:val="22"/>
+                <w:szCs w:val="22"/>
+              </w:rPr>
+              <w:t xml:space="preserve">(ii) Explain the result by stating the order in which the operators / , ** , % and + are applied and what the int() conversion does to the value.</w:t>
+            </w:r>
+          </w:p>
+        </w:tc>
+        <w:tc>
+          <w:tcPr>
+            <w:tcW w:w="810" w:type="dxa"/>
+          </w:tcPr>
+          <w:p>
+            <w:pPr>
+              <w:spacing w:after="0" w:line="240" w:lineRule="auto"/>
+              <w:jc w:val="center"/>
+              <w:rPr>
+                <w:rFonts w:ascii="Times New Roman" w:hAnsi="Times New Roman"/>
+                <w:b/>
+                <w:bCs/>
+                <w:sz w:val="24"/>
+                <w:szCs w:val="24"/>
+              </w:rPr>
+            </w:pPr>
+            <w:r>
+              <w:rPr>
+                <w:rFonts w:ascii="Times New Roman" w:hAnsi="Times New Roman" w:cs="Times New Roman"/>
+                <w:b/>
+                <w:bCs/>
+                <w:sz w:val="20"/>
+                <w:szCs w:val="20"/>
+              </w:rPr>
+              <w:t xml:space="preserve">3</w:t>
+            </w:r>
+          </w:p>
+        </w:tc>
+        <w:tc>
+          <w:tcPr>
+            <w:tcW w:w="841" w:type="dxa"/>
+          </w:tcPr>
+          <w:p>
+            <w:pPr>
+              <w:spacing w:after="0" w:line="240" w:lineRule="auto"/>
+              <w:jc w:val="center"/>
+              <w:rPr>
+                <w:rFonts w:ascii="Times New Roman" w:hAnsi="Times New Roman"/>
+                <w:b/>
+                <w:bCs/>
+                <w:sz w:val="24"/>
+                <w:szCs w:val="24"/>
+              </w:rPr>
+            </w:pPr>
+            <w:r>
+              <w:rPr>
+                <w:rFonts w:ascii="Times New Roman" w:hAnsi="Times New Roman" w:cs="Times New Roman"/>
+                <w:b/>
+                <w:bCs/>
+                <w:sz w:val="20"/>
+                <w:szCs w:val="20"/>
+              </w:rPr>
+              <w:t xml:space="preserve">A</w:t>
+            </w:r>
+          </w:p>
+        </w:tc>
+      </w:tr>
+      <w:tr>
+        <w:trPr>
+          <w:trHeight w:val="677"/>
         </w:trPr>
         <w:tc>
           <w:tcPr>
@@ -6487,7 +6630,6 @@
       <w:tr>
         <w:trPr>
           <w:trHeight w:val="260"/>
-          <w:tblHeader/>
         </w:trPr>
         <w:tc>
           <w:tcPr>
@@ -6599,7 +6741,7 @@
       </w:tr>
       <w:tr>
         <w:trPr>
-          <w:trHeight w:val="240"/>
+          <w:trHeight w:val="260"/>
         </w:trPr>
         <w:tc>
           <w:tcPr>
@@ -6655,7 +6797,7 @@
                 <w:sz w:val="22"/>
                 <w:szCs w:val="22"/>
               </w:rPr>
-              <w:t xml:space="preserve">Write a Python program that reads the total distance travelled by a vehicle in kilometre (float) and the total time taken in minutes (float) from the user. The program should</w:t>
+              <w:t xml:space="preserve">An electricity distribution company wants a billing system for its consumers.</w:t>
             </w:r>
           </w:p>
           <w:p>
@@ -6668,7 +6810,7 @@
                 <w:sz w:val="22"/>
                 <w:szCs w:val="22"/>
               </w:rPr>
-              <w:t xml:space="preserve">(i)    compute and print the average speed in km/hour rounded to two decimal places;</w:t>
+              <w:t xml:space="preserve">First write an algorithm and draw a flowchart for the system described below, and then write a Python program for the same system.</w:t>
             </w:r>
           </w:p>
           <w:p>
@@ -6681,7 +6823,7 @@
                 <w:sz w:val="22"/>
                 <w:szCs w:val="22"/>
               </w:rPr>
-              <w:t xml:space="preserve">(ii)   print the time taken in the form  HH hours MM minutes SS seconds  using only the arithmetic operators // and % together with typecasting (no data structure or built-in string function is allowed);</w:t>
+              <w:t xml:space="preserve">System specification : the program processes the bills of exactly five consumers, one after another, using a loop. For every consumer it reads the consumer number, the previous month meter reading, the current month meter reading (all integers) and the type of connection (1 for domestic, 2 for commercial). The program must</w:t>
             </w:r>
           </w:p>
           <w:p>
@@ -6694,7 +6836,7 @@
                 <w:sz w:val="22"/>
                 <w:szCs w:val="22"/>
               </w:rPr>
-              <w:t xml:space="preserve">(iii)  print the single word FAST if the average speed is more than 60 km/hour and NORMAL otherwise, by using one single line ternary (conditional) expression.</w:t>
+              <w:t xml:space="preserve">a)     validate the readings : if the current reading is smaller than the previous reading, print INVALID READING and read the two readings again, repeating this until a valid pair is entered;</w:t>
             </w:r>
           </w:p>
           <w:p>
@@ -6707,116 +6849,35 @@
                 <w:sz w:val="22"/>
                 <w:szCs w:val="22"/>
               </w:rPr>
-              <w:t xml:space="preserve">Assume suitable sample input and show the output.</w:t>
-            </w:r>
-          </w:p>
-        </w:tc>
-        <w:tc>
-          <w:tcPr>
-            <w:tcW w:w="900" w:type="dxa"/>
-          </w:tcPr>
-          <w:p>
-            <w:pPr>
-              <w:spacing w:after="0" w:line="240" w:lineRule="auto"/>
-              <w:jc w:val="center"/>
-              <w:rPr>
-                <w:rFonts w:ascii="Times New Roman" w:hAnsi="Times New Roman"/>
-                <w:b/>
-                <w:bCs/>
-                <w:sz w:val="24"/>
-                <w:szCs w:val="24"/>
-              </w:rPr>
-            </w:pPr>
-            <w:r>
-              <w:rPr>
-                <w:rFonts w:ascii="Times New Roman" w:hAnsi="Times New Roman" w:cs="Times New Roman"/>
-                <w:b/>
-                <w:bCs/>
-                <w:sz w:val="20"/>
-                <w:szCs w:val="20"/>
-              </w:rPr>
-              <w:t xml:space="preserve">4</w:t>
-            </w:r>
-          </w:p>
-        </w:tc>
-        <w:tc>
-          <w:tcPr>
-            <w:tcW w:w="1348" w:type="dxa"/>
-          </w:tcPr>
-          <w:p>
-            <w:pPr>
-              <w:spacing w:after="0" w:line="240" w:lineRule="auto"/>
-              <w:jc w:val="center"/>
-              <w:jc w:val="center"/>
-              <w:rPr>
-                <w:rFonts w:ascii="Times New Roman" w:hAnsi="Times New Roman"/>
-                <w:b/>
-                <w:bCs/>
-                <w:sz w:val="24"/>
-                <w:szCs w:val="24"/>
-              </w:rPr>
-            </w:pPr>
-            <w:r>
-              <w:rPr>
-                <w:rFonts w:ascii="Times New Roman" w:hAnsi="Times New Roman" w:cs="Times New Roman"/>
-                <w:b/>
-                <w:bCs/>
-                <w:sz w:val="20"/>
-                <w:szCs w:val="20"/>
-              </w:rPr>
-              <w:t xml:space="preserve">A</w:t>
-            </w:r>
-          </w:p>
-        </w:tc>
-      </w:tr>
-      <w:tr>
-        <w:trPr>
-          <w:trHeight w:val="240"/>
-        </w:trPr>
-        <w:tc>
-          <w:tcPr>
-            <w:tcW w:w="620" w:type="dxa"/>
-          </w:tcPr>
-          <w:p>
-            <w:pPr>
-              <w:spacing w:after="0" w:line="240" w:lineRule="auto"/>
-            </w:pPr>
-            <w:r>
-              <w:rPr>
-                <w:rFonts w:ascii="Times New Roman" w:hAnsi="Times New Roman" w:cs="Times New Roman"/>
-                <w:b/>
-                <w:bCs/>
+              <w:t xml:space="preserve">b)     compute the units consumed as current reading minus previous reading;</w:t>
+            </w:r>
+          </w:p>
+          <w:p>
+            <w:pPr>
+              <w:spacing w:after="0" w:line="240" w:lineRule="auto"/>
+            </w:pPr>
+            <w:r>
+              <w:rPr>
+                <w:rFonts w:ascii="Times New Roman" w:hAnsi="Times New Roman" w:cs="Times New Roman"/>
                 <w:sz w:val="22"/>
                 <w:szCs w:val="22"/>
               </w:rPr>
-              <w:t xml:space="preserve"/>
-            </w:r>
-          </w:p>
-        </w:tc>
-        <w:tc>
-          <w:tcPr>
-            <w:tcW w:w="625" w:type="dxa"/>
-          </w:tcPr>
-          <w:p>
-            <w:pPr>
-              <w:spacing w:after="0" w:line="240" w:lineRule="auto"/>
-            </w:pPr>
-            <w:r>
-              <w:rPr>
-                <w:rFonts w:ascii="Times New Roman" w:hAnsi="Times New Roman" w:cs="Times New Roman"/>
-                <w:b/>
-                <w:bCs/>
+              <w:t xml:space="preserve">c)     compute the energy charge : for a domestic connection the first 100 units are charged at Rs. 3 per unit, the next 100 units at Rs. 5 per unit and every remaining unit at Rs. 7 per unit; for a commercial connection every unit is charged at Rs. 9 per unit;</w:t>
+            </w:r>
+          </w:p>
+          <w:p>
+            <w:pPr>
+              <w:spacing w:after="0" w:line="240" w:lineRule="auto"/>
+            </w:pPr>
+            <w:r>
+              <w:rPr>
+                <w:rFonts w:ascii="Times New Roman" w:hAnsi="Times New Roman" w:cs="Times New Roman"/>
                 <w:sz w:val="22"/>
                 <w:szCs w:val="22"/>
               </w:rPr>
-              <w:t xml:space="preserve">(B)</w:t>
-            </w:r>
-          </w:p>
-        </w:tc>
-        <w:tc>
-          <w:tcPr>
-            <w:tcW w:w="8110" w:type="dxa"/>
-          </w:tcPr>
+              <w:t xml:space="preserve">d)     add a service charge of Rs. 50 for a domestic connection and Rs. 150 for a commercial connection, and compute the total bill;</w:t>
+            </w:r>
+          </w:p>
           <w:p>
             <w:pPr>
               <w:spacing w:after="0" w:line="240" w:lineRule="auto"/>
@@ -6827,7 +6888,7 @@
                 <w:sz w:val="22"/>
                 <w:szCs w:val="22"/>
               </w:rPr>
-              <w:t xml:space="preserve">Write a Python program that reads a positive integer N from the user and generates the Collatz sequence starting from N until the value 1 is reached (Rule : if the current value is even, divide it by 2 using integer division; if it is odd, multiply it by 3 and add 1). The program must print</w:t>
+              <w:t xml:space="preserve">e)     print the consumer number, the units consumed, the energy charge, the service charge and the total bill;</w:t>
             </w:r>
           </w:p>
           <w:p>
@@ -6840,7 +6901,7 @@
                 <w:sz w:val="22"/>
                 <w:szCs w:val="22"/>
               </w:rPr>
-              <w:t xml:space="preserve">(i)    every value of the sequence on the same line separated by a single space,</w:t>
+              <w:t xml:space="preserve">f)     print HIGH USAGE if the total bill is more than Rs. 2000 and NORMAL USAGE otherwise;</w:t>
             </w:r>
           </w:p>
           <w:p>
@@ -6853,7 +6914,7 @@
                 <w:sz w:val="22"/>
                 <w:szCs w:val="22"/>
               </w:rPr>
-              <w:t xml:space="preserve">(ii)   the total number of steps taken to reach 1, and</w:t>
+              <w:t xml:space="preserve">g)     after all five consumers have been processed, print how many of them were billed more than Rs. 2000.</w:t>
             </w:r>
           </w:p>
           <w:p>
@@ -6866,33 +6927,7 @@
                 <w:sz w:val="22"/>
                 <w:szCs w:val="22"/>
               </w:rPr>
-              <w:t xml:space="preserve">(iii)  the largest value that appeared in the sequence.</w:t>
-            </w:r>
-          </w:p>
-          <w:p>
-            <w:pPr>
-              <w:spacing w:after="0" w:line="240" w:lineRule="auto"/>
-            </w:pPr>
-            <w:r>
-              <w:rPr>
-                <w:rFonts w:ascii="Times New Roman" w:hAnsi="Times New Roman" w:cs="Times New Roman"/>
-                <w:sz w:val="22"/>
-                <w:szCs w:val="22"/>
-              </w:rPr>
-              <w:t xml:space="preserve">Use of string, list, tuple or any other data structure and their built-in functions is not allowed.</w:t>
-            </w:r>
-          </w:p>
-          <w:p>
-            <w:pPr>
-              <w:spacing w:after="0" w:line="240" w:lineRule="auto"/>
-            </w:pPr>
-            <w:r>
-              <w:rPr>
-                <w:rFonts w:ascii="Times New Roman" w:hAnsi="Times New Roman" w:cs="Times New Roman"/>
-                <w:sz w:val="22"/>
-                <w:szCs w:val="22"/>
-              </w:rPr>
-              <w:t xml:space="preserve">Example :  For N = 6 the sequence is  6 3 10 5 16 8 4 2 1 ,  steps = 8 ,  largest value = 16</w:t>
+              <w:t xml:space="preserve">Use of functions, lists, tuples, dictionaries, sets, files or modules is not allowed.</w:t>
             </w:r>
           </w:p>
         </w:tc>
@@ -6920,7 +6955,7 @@
                 <w:sz w:val="20"/>
                 <w:szCs w:val="20"/>
               </w:rPr>
-              <w:t xml:space="preserve">5</w:t>
+              <w:t xml:space="preserve">(09)</w:t>
             </w:r>
           </w:p>
         </w:tc>

</xml_diff>